<commit_message>
Document iteration, robust-loss, outlier and ensemble Li regression checks
</commit_message>
<xml_diff>
--- a/li-concentration-regression/Li_group_meeting_report.docx
+++ b/li-concentration-regression/Li_group_meeting_report.docx
@@ -9039,6 +9039,2547 @@
           <w:sz w:val="17"/>
         </w:rPr>
         <w:t>所有表格和图来自本次实际运行。未将未运行方案写成已验证；未把收敛警告写成通过；未把变量重要性写成因果贡献。</w:t>
+      </w:r>
+    </w:p>
+    <w:p>
+      <w:r>
+        <w:br w:type="page"/>
+      </w:r>
+    </w:p>
+    <w:p>
+      <w:pPr>
+        <w:pStyle w:val="Heading1"/>
+      </w:pPr>
+      <w:r>
+        <w:t>补充实验一：R²是否已经到上限？</w:t>
+      </w:r>
+    </w:p>
+    <w:p>
+      <w:r>
+        <w:rPr>
+          <w:b/>
+        </w:rPr>
+        <w:t>结论：不能认定已到上限；本轮仍有小幅提升，但没有出现足以支持明显突破的结果。也没有、且无法声称穷尽所有机器学习方法。</w:t>
+      </w:r>
+    </w:p>
+    <w:p>
+      <w:r>
+        <w:rPr>
+          <w:b w:val="0"/>
+        </w:rPr>
+        <w:t>针对“是否试过迭代和删异常值”的问题，本轮新增63组配置（含对照）、315个五折验证分数，并比较11个RF/SVR加权比例。此前588组搜索记录继续保留。各类方案均先根据训练集CV确定，再对完整273条固定测试记录评价一次；所有成功和退化结果一并记录。</w:t>
+      </w:r>
+    </w:p>
+    <w:tbl>
+      <w:tblPr>
+        <w:tblStyle w:val="TableGrid"/>
+        <w:tblW w:type="auto" w:w="0"/>
+        <w:tblLook w:firstColumn="1" w:firstRow="1" w:lastColumn="0" w:lastRow="0" w:noHBand="0" w:noVBand="1" w:val="04A0"/>
+      </w:tblPr>
+      <w:tblGrid>
+        <w:gridCol w:w="3213"/>
+        <w:gridCol w:w="3213"/>
+        <w:gridCol w:w="3213"/>
+      </w:tblGrid>
+      <w:tr>
+        <w:trPr>
+          <w:tblHeader/>
+          <w:cantSplit/>
+        </w:trPr>
+        <w:tc>
+          <w:tcPr>
+            <w:tcW w:type="dxa" w:w="3213"/>
+          </w:tcPr>
+          <w:p>
+            <w:pPr>
+              <w:spacing w:after="60"/>
+            </w:pPr>
+            <w:r>
+              <w:rPr>
+                <w:b/>
+                <w:sz w:val="18"/>
+              </w:rPr>
+              <w:t>问题</w:t>
+            </w:r>
+          </w:p>
+        </w:tc>
+        <w:tc>
+          <w:tcPr>
+            <w:tcW w:type="dxa" w:w="3213"/>
+          </w:tcPr>
+          <w:p>
+            <w:pPr>
+              <w:spacing w:after="60"/>
+            </w:pPr>
+            <w:r>
+              <w:rPr>
+                <w:b/>
+                <w:sz w:val="18"/>
+              </w:rPr>
+              <w:t>已补做的检验</w:t>
+            </w:r>
+          </w:p>
+        </w:tc>
+        <w:tc>
+          <w:tcPr>
+            <w:tcW w:type="dxa" w:w="3213"/>
+          </w:tcPr>
+          <w:p>
+            <w:pPr>
+              <w:spacing w:after="60"/>
+            </w:pPr>
+            <w:r>
+              <w:rPr>
+                <w:b/>
+                <w:sz w:val="18"/>
+              </w:rPr>
+              <w:t>边界</w:t>
+            </w:r>
+          </w:p>
+        </w:tc>
+      </w:tr>
+      <w:tr>
+        <w:trPr>
+          <w:cantSplit/>
+        </w:trPr>
+        <w:tc>
+          <w:tcPr>
+            <w:tcW w:type="dxa" w:w="3213"/>
+          </w:tcPr>
+          <w:p>
+            <w:pPr>
+              <w:spacing w:after="60"/>
+            </w:pPr>
+            <w:r>
+              <w:rPr>
+                <w:b w:val="0"/>
+                <w:sz w:val="18"/>
+              </w:rPr>
+              <w:t>更多树／轮次</w:t>
+            </w:r>
+          </w:p>
+        </w:tc>
+        <w:tc>
+          <w:tcPr>
+            <w:tcW w:type="dxa" w:w="3213"/>
+          </w:tcPr>
+          <w:p>
+            <w:pPr>
+              <w:spacing w:after="60"/>
+            </w:pPr>
+            <w:r>
+              <w:rPr>
+                <w:b w:val="0"/>
+                <w:sz w:val="18"/>
+              </w:rPr>
+              <w:t>RF及两种LightGBM各50、100、300、500、1000、2000轮</w:t>
+            </w:r>
+          </w:p>
+        </w:tc>
+        <w:tc>
+          <w:tcPr>
+            <w:tcW w:type="dxa" w:w="3213"/>
+          </w:tcPr>
+          <w:p>
+            <w:pPr>
+              <w:spacing w:after="60"/>
+            </w:pPr>
+            <w:r>
+              <w:rPr>
+                <w:b w:val="0"/>
+                <w:sz w:val="18"/>
+              </w:rPr>
+              <w:t>18组；不靠测试分数选轮次</w:t>
+            </w:r>
+          </w:p>
+        </w:tc>
+      </w:tr>
+      <w:tr>
+        <w:trPr>
+          <w:cantSplit/>
+        </w:trPr>
+        <w:tc>
+          <w:tcPr>
+            <w:tcW w:type="dxa" w:w="3213"/>
+          </w:tcPr>
+          <w:p>
+            <w:pPr>
+              <w:spacing w:after="60"/>
+            </w:pPr>
+            <w:r>
+              <w:rPr>
+                <w:b w:val="0"/>
+                <w:sz w:val="18"/>
+              </w:rPr>
+              <w:t>稳健拟合</w:t>
+            </w:r>
+          </w:p>
+        </w:tc>
+        <w:tc>
+          <w:tcPr>
+            <w:tcW w:type="dxa" w:w="3213"/>
+          </w:tcPr>
+          <w:p>
+            <w:pPr>
+              <w:spacing w:after="60"/>
+            </w:pPr>
+            <w:r>
+              <w:rPr>
+                <w:b w:val="0"/>
+                <w:sz w:val="18"/>
+              </w:rPr>
+              <w:t>16组Huber与16组匹配平方损失梯度提升</w:t>
+            </w:r>
+          </w:p>
+        </w:tc>
+        <w:tc>
+          <w:tcPr>
+            <w:tcW w:type="dxa" w:w="3213"/>
+          </w:tcPr>
+          <w:p>
+            <w:pPr>
+              <w:spacing w:after="60"/>
+            </w:pPr>
+            <w:r>
+              <w:rPr>
+                <w:b w:val="0"/>
+                <w:sz w:val="18"/>
+              </w:rPr>
+              <w:t>降低极端残差影响，不等于识别错误记录</w:t>
+            </w:r>
+          </w:p>
+        </w:tc>
+      </w:tr>
+      <w:tr>
+        <w:trPr>
+          <w:cantSplit/>
+        </w:trPr>
+        <w:tc>
+          <w:tcPr>
+            <w:tcW w:type="dxa" w:w="3213"/>
+          </w:tcPr>
+          <w:p>
+            <w:pPr>
+              <w:spacing w:after="60"/>
+            </w:pPr>
+            <w:r>
+              <w:rPr>
+                <w:b w:val="0"/>
+                <w:sz w:val="18"/>
+              </w:rPr>
+              <w:t>删除异常样本</w:t>
+            </w:r>
+          </w:p>
+        </w:tc>
+        <w:tc>
+          <w:tcPr>
+            <w:tcW w:type="dxa" w:w="3213"/>
+          </w:tcPr>
+          <w:p>
+            <w:pPr>
+              <w:spacing w:after="60"/>
+            </w:pPr>
+            <w:r>
+              <w:rPr>
+                <w:b w:val="0"/>
+                <w:sz w:val="18"/>
+              </w:rPr>
+              <w:t>目标分位数、X空间IsolationForest、训练OOF残差，各1%、2%、5%</w:t>
+            </w:r>
+          </w:p>
+        </w:tc>
+        <w:tc>
+          <w:tcPr>
+            <w:tcW w:type="dxa" w:w="3213"/>
+          </w:tcPr>
+          <w:p>
+            <w:pPr>
+              <w:spacing w:after="60"/>
+            </w:pPr>
+            <w:r>
+              <w:rPr>
+                <w:b w:val="0"/>
+                <w:sz w:val="18"/>
+              </w:rPr>
+              <w:t>规则只在当折训练子集估计</w:t>
+            </w:r>
+          </w:p>
+        </w:tc>
+      </w:tr>
+      <w:tr>
+        <w:trPr>
+          <w:cantSplit/>
+        </w:trPr>
+        <w:tc>
+          <w:tcPr>
+            <w:tcW w:type="dxa" w:w="3213"/>
+          </w:tcPr>
+          <w:p>
+            <w:pPr>
+              <w:spacing w:after="60"/>
+            </w:pPr>
+            <w:r>
+              <w:rPr>
+                <w:b w:val="0"/>
+                <w:sz w:val="18"/>
+              </w:rPr>
+              <w:t>缩尾</w:t>
+            </w:r>
+          </w:p>
+        </w:tc>
+        <w:tc>
+          <w:tcPr>
+            <w:tcW w:type="dxa" w:w="3213"/>
+          </w:tcPr>
+          <w:p>
+            <w:pPr>
+              <w:spacing w:after="60"/>
+            </w:pPr>
+            <w:r>
+              <w:rPr>
+                <w:b w:val="0"/>
+                <w:sz w:val="18"/>
+              </w:rPr>
+              <w:t>同样分位点截断训练目标，各1%、2%、5%</w:t>
+            </w:r>
+          </w:p>
+        </w:tc>
+        <w:tc>
+          <w:tcPr>
+            <w:tcW w:type="dxa" w:w="3213"/>
+          </w:tcPr>
+          <w:p>
+            <w:pPr>
+              <w:spacing w:after="60"/>
+            </w:pPr>
+            <w:r>
+              <w:rPr>
+                <w:b w:val="0"/>
+                <w:sz w:val="18"/>
+              </w:rPr>
+              <w:t>不修改验证或测试观测值</w:t>
+            </w:r>
+          </w:p>
+        </w:tc>
+      </w:tr>
+      <w:tr>
+        <w:trPr>
+          <w:cantSplit/>
+        </w:trPr>
+        <w:tc>
+          <w:tcPr>
+            <w:tcW w:type="dxa" w:w="3213"/>
+          </w:tcPr>
+          <w:p>
+            <w:pPr>
+              <w:spacing w:after="60"/>
+            </w:pPr>
+            <w:r>
+              <w:rPr>
+                <w:b w:val="0"/>
+                <w:sz w:val="18"/>
+              </w:rPr>
+              <w:t>模型互补</w:t>
+            </w:r>
+          </w:p>
+        </w:tc>
+        <w:tc>
+          <w:tcPr>
+            <w:tcW w:type="dxa" w:w="3213"/>
+          </w:tcPr>
+          <w:p>
+            <w:pPr>
+              <w:spacing w:after="60"/>
+            </w:pPr>
+            <w:r>
+              <w:rPr>
+                <w:b w:val="0"/>
+                <w:sz w:val="18"/>
+              </w:rPr>
+              <w:t>已选RF和SVR，RF权重0至1、间隔0.1</w:t>
+            </w:r>
+          </w:p>
+        </w:tc>
+        <w:tc>
+          <w:tcPr>
+            <w:tcW w:type="dxa" w:w="3213"/>
+          </w:tcPr>
+          <w:p>
+            <w:pPr>
+              <w:spacing w:after="60"/>
+            </w:pPr>
+            <w:r>
+              <w:rPr>
+                <w:b w:val="0"/>
+                <w:sz w:val="18"/>
+              </w:rPr>
+              <w:t>11种权重，仅按训练OOF五折均值选择</w:t>
+            </w:r>
+          </w:p>
+        </w:tc>
+      </w:tr>
+    </w:tbl>
+    <w:p>
+      <w:r>
+        <w:rPr>
+          <w:b w:val="0"/>
+        </w:rPr>
+        <w:t>统一条件：1363条数据（延续原代码Li≤2000），1090训练／273测试，目标ln(1+Li)，原随机划分种子42，五折种子20261018。采用已有6个等价信息组；全部候选预测均使用固定非负下限。原代码中的Li&gt;2000筛选没有在本轮重新论证。</w:t>
+      </w:r>
+    </w:p>
+    <w:p>
+      <w:r>
+        <w:rPr>
+          <w:b w:val="0"/>
+        </w:rPr>
+        <w:t>迭代不是重复换随机种子直到分数变好。随机森林的树数、提升树的逐轮残差拟合、MLP的数值优化迭代含义不同。此前MLP已扩至5000步并检查收敛；本轮重点检查树数曲线。</w:t>
+      </w:r>
+    </w:p>
+    <w:p>
+      <w:r>
+        <w:rPr>
+          <w:b w:val="0"/>
+        </w:rPr>
+        <w:t>成熟实现来源：scikit-learn GitHub仓库中的RandomForestRegressor、GradientBoostingRegressor、IsolationForest及cross_val_predict；具体链接、参数、逐折分数保存在additional_experiments/。</w:t>
+      </w:r>
+    </w:p>
+    <w:p>
+      <w:r>
+        <w:br w:type="page"/>
+      </w:r>
+    </w:p>
+    <w:p>
+      <w:pPr>
+        <w:pStyle w:val="Heading1"/>
+      </w:pPr>
+      <w:r>
+        <w:t>补充实验二：为什么更多迭代不一定更好？</w:t>
+      </w:r>
+    </w:p>
+    <w:p>
+      <w:r>
+        <w:drawing>
+          <wp:inline xmlns:a="http://schemas.openxmlformats.org/drawingml/2006/main" xmlns:pic="http://schemas.openxmlformats.org/drawingml/2006/picture">
+            <wp:extent cx="5940000" cy="1782000"/>
+            <wp:docPr id="8" name="Picture 8"/>
+            <wp:cNvGraphicFramePr>
+              <a:graphicFrameLocks noChangeAspect="1"/>
+            </wp:cNvGraphicFramePr>
+            <a:graphic>
+              <a:graphicData uri="http://schemas.openxmlformats.org/drawingml/2006/picture">
+                <pic:pic>
+                  <pic:nvPicPr>
+                    <pic:cNvPr id="0" name="iteration_curves.png"/>
+                    <pic:cNvPicPr/>
+                  </pic:nvPicPr>
+                  <pic:blipFill>
+                    <a:blip r:embed="rId18"/>
+                    <a:stretch>
+                      <a:fillRect/>
+                    </a:stretch>
+                  </pic:blipFill>
+                  <pic:spPr>
+                    <a:xfrm>
+                      <a:off x="0" y="0"/>
+                      <a:ext cx="5940000" cy="1782000"/>
+                    </a:xfrm>
+                    <a:prstGeom prst="rect"/>
+                  </pic:spPr>
+                </pic:pic>
+              </a:graphicData>
+            </a:graphic>
+          </wp:inline>
+        </w:drawing>
+      </w:r>
+    </w:p>
+    <w:p>
+      <w:r>
+        <w:rPr>
+          <w:b w:val="0"/>
+        </w:rPr>
+        <w:t>图：训练CV均值；阴影为五折标准差，表示折间波动，不是置信区间。测试结果未用于绘制或选择曲线峰值。</w:t>
+      </w:r>
+    </w:p>
+    <w:tbl>
+      <w:tblPr>
+        <w:tblStyle w:val="TableGrid"/>
+        <w:tblW w:type="auto" w:w="0"/>
+        <w:tblLook w:firstColumn="1" w:firstRow="1" w:lastColumn="0" w:lastRow="0" w:noHBand="0" w:noVBand="1" w:val="04A0"/>
+      </w:tblPr>
+      <w:tblGrid>
+        <w:gridCol w:w="1377"/>
+        <w:gridCol w:w="1377"/>
+        <w:gridCol w:w="1377"/>
+        <w:gridCol w:w="1377"/>
+        <w:gridCol w:w="1377"/>
+        <w:gridCol w:w="1377"/>
+        <w:gridCol w:w="1377"/>
+      </w:tblGrid>
+      <w:tr>
+        <w:trPr>
+          <w:tblHeader/>
+          <w:cantSplit/>
+        </w:trPr>
+        <w:tc>
+          <w:tcPr>
+            <w:tcW w:type="dxa" w:w="1377"/>
+          </w:tcPr>
+          <w:p>
+            <w:pPr>
+              <w:spacing w:after="60"/>
+            </w:pPr>
+            <w:r>
+              <w:rPr>
+                <w:b/>
+                <w:sz w:val="17"/>
+              </w:rPr>
+              <w:t>训练CV R²</w:t>
+            </w:r>
+          </w:p>
+        </w:tc>
+        <w:tc>
+          <w:tcPr>
+            <w:tcW w:type="dxa" w:w="1377"/>
+          </w:tcPr>
+          <w:p>
+            <w:pPr>
+              <w:spacing w:after="60"/>
+            </w:pPr>
+            <w:r>
+              <w:rPr>
+                <w:b/>
+                <w:sz w:val="17"/>
+              </w:rPr>
+              <w:t>50</w:t>
+            </w:r>
+          </w:p>
+        </w:tc>
+        <w:tc>
+          <w:tcPr>
+            <w:tcW w:type="dxa" w:w="1377"/>
+          </w:tcPr>
+          <w:p>
+            <w:pPr>
+              <w:spacing w:after="60"/>
+            </w:pPr>
+            <w:r>
+              <w:rPr>
+                <w:b/>
+                <w:sz w:val="17"/>
+              </w:rPr>
+              <w:t>100</w:t>
+            </w:r>
+          </w:p>
+        </w:tc>
+        <w:tc>
+          <w:tcPr>
+            <w:tcW w:type="dxa" w:w="1377"/>
+          </w:tcPr>
+          <w:p>
+            <w:pPr>
+              <w:spacing w:after="60"/>
+            </w:pPr>
+            <w:r>
+              <w:rPr>
+                <w:b/>
+                <w:sz w:val="17"/>
+              </w:rPr>
+              <w:t>300</w:t>
+            </w:r>
+          </w:p>
+        </w:tc>
+        <w:tc>
+          <w:tcPr>
+            <w:tcW w:type="dxa" w:w="1377"/>
+          </w:tcPr>
+          <w:p>
+            <w:pPr>
+              <w:spacing w:after="60"/>
+            </w:pPr>
+            <w:r>
+              <w:rPr>
+                <w:b/>
+                <w:sz w:val="17"/>
+              </w:rPr>
+              <w:t>500</w:t>
+            </w:r>
+          </w:p>
+        </w:tc>
+        <w:tc>
+          <w:tcPr>
+            <w:tcW w:type="dxa" w:w="1377"/>
+          </w:tcPr>
+          <w:p>
+            <w:pPr>
+              <w:spacing w:after="60"/>
+            </w:pPr>
+            <w:r>
+              <w:rPr>
+                <w:b/>
+                <w:sz w:val="17"/>
+              </w:rPr>
+              <w:t>1000</w:t>
+            </w:r>
+          </w:p>
+        </w:tc>
+        <w:tc>
+          <w:tcPr>
+            <w:tcW w:type="dxa" w:w="1377"/>
+          </w:tcPr>
+          <w:p>
+            <w:pPr>
+              <w:spacing w:after="60"/>
+            </w:pPr>
+            <w:r>
+              <w:rPr>
+                <w:b/>
+                <w:sz w:val="17"/>
+              </w:rPr>
+              <w:t>2000</w:t>
+            </w:r>
+          </w:p>
+        </w:tc>
+      </w:tr>
+      <w:tr>
+        <w:trPr>
+          <w:cantSplit/>
+        </w:trPr>
+        <w:tc>
+          <w:tcPr>
+            <w:tcW w:type="dxa" w:w="1377"/>
+          </w:tcPr>
+          <w:p>
+            <w:pPr>
+              <w:spacing w:after="60"/>
+            </w:pPr>
+            <w:r>
+              <w:rPr>
+                <w:b w:val="0"/>
+                <w:sz w:val="17"/>
+              </w:rPr>
+              <w:t>RF</w:t>
+            </w:r>
+          </w:p>
+        </w:tc>
+        <w:tc>
+          <w:tcPr>
+            <w:tcW w:type="dxa" w:w="1377"/>
+          </w:tcPr>
+          <w:p>
+            <w:pPr>
+              <w:spacing w:after="60"/>
+            </w:pPr>
+            <w:r>
+              <w:rPr>
+                <w:b w:val="0"/>
+                <w:sz w:val="17"/>
+              </w:rPr>
+              <w:t>0.4419</w:t>
+            </w:r>
+          </w:p>
+        </w:tc>
+        <w:tc>
+          <w:tcPr>
+            <w:tcW w:type="dxa" w:w="1377"/>
+          </w:tcPr>
+          <w:p>
+            <w:pPr>
+              <w:spacing w:after="60"/>
+            </w:pPr>
+            <w:r>
+              <w:rPr>
+                <w:b w:val="0"/>
+                <w:sz w:val="17"/>
+              </w:rPr>
+              <w:t>0.4377</w:t>
+            </w:r>
+          </w:p>
+        </w:tc>
+        <w:tc>
+          <w:tcPr>
+            <w:tcW w:type="dxa" w:w="1377"/>
+          </w:tcPr>
+          <w:p>
+            <w:pPr>
+              <w:spacing w:after="60"/>
+            </w:pPr>
+            <w:r>
+              <w:rPr>
+                <w:b w:val="0"/>
+                <w:sz w:val="17"/>
+              </w:rPr>
+              <w:t>0.4366</w:t>
+            </w:r>
+          </w:p>
+        </w:tc>
+        <w:tc>
+          <w:tcPr>
+            <w:tcW w:type="dxa" w:w="1377"/>
+          </w:tcPr>
+          <w:p>
+            <w:pPr>
+              <w:spacing w:after="60"/>
+            </w:pPr>
+            <w:r>
+              <w:rPr>
+                <w:b w:val="0"/>
+                <w:sz w:val="17"/>
+              </w:rPr>
+              <w:t>0.4366</w:t>
+            </w:r>
+          </w:p>
+        </w:tc>
+        <w:tc>
+          <w:tcPr>
+            <w:tcW w:type="dxa" w:w="1377"/>
+          </w:tcPr>
+          <w:p>
+            <w:pPr>
+              <w:spacing w:after="60"/>
+            </w:pPr>
+            <w:r>
+              <w:rPr>
+                <w:b w:val="0"/>
+                <w:sz w:val="17"/>
+              </w:rPr>
+              <w:t>0.4364</w:t>
+            </w:r>
+          </w:p>
+        </w:tc>
+        <w:tc>
+          <w:tcPr>
+            <w:tcW w:type="dxa" w:w="1377"/>
+          </w:tcPr>
+          <w:p>
+            <w:pPr>
+              <w:spacing w:after="60"/>
+            </w:pPr>
+            <w:r>
+              <w:rPr>
+                <w:b w:val="0"/>
+                <w:sz w:val="17"/>
+              </w:rPr>
+              <w:t>0.4376</w:t>
+            </w:r>
+          </w:p>
+        </w:tc>
+      </w:tr>
+      <w:tr>
+        <w:trPr>
+          <w:cantSplit/>
+        </w:trPr>
+        <w:tc>
+          <w:tcPr>
+            <w:tcW w:type="dxa" w:w="1377"/>
+          </w:tcPr>
+          <w:p>
+            <w:pPr>
+              <w:spacing w:after="60"/>
+            </w:pPr>
+            <w:r>
+              <w:rPr>
+                <w:b w:val="0"/>
+                <w:sz w:val="17"/>
+              </w:rPr>
+              <w:t>原LightGBM</w:t>
+            </w:r>
+          </w:p>
+        </w:tc>
+        <w:tc>
+          <w:tcPr>
+            <w:tcW w:type="dxa" w:w="1377"/>
+          </w:tcPr>
+          <w:p>
+            <w:pPr>
+              <w:spacing w:after="60"/>
+            </w:pPr>
+            <w:r>
+              <w:rPr>
+                <w:b w:val="0"/>
+                <w:sz w:val="17"/>
+              </w:rPr>
+              <w:t>0.3709</w:t>
+            </w:r>
+          </w:p>
+        </w:tc>
+        <w:tc>
+          <w:tcPr>
+            <w:tcW w:type="dxa" w:w="1377"/>
+          </w:tcPr>
+          <w:p>
+            <w:pPr>
+              <w:spacing w:after="60"/>
+            </w:pPr>
+            <w:r>
+              <w:rPr>
+                <w:b w:val="0"/>
+                <w:sz w:val="17"/>
+              </w:rPr>
+              <w:t>0.3998</w:t>
+            </w:r>
+          </w:p>
+        </w:tc>
+        <w:tc>
+          <w:tcPr>
+            <w:tcW w:type="dxa" w:w="1377"/>
+          </w:tcPr>
+          <w:p>
+            <w:pPr>
+              <w:spacing w:after="60"/>
+            </w:pPr>
+            <w:r>
+              <w:rPr>
+                <w:b w:val="0"/>
+                <w:sz w:val="17"/>
+              </w:rPr>
+              <w:t>0.4095</w:t>
+            </w:r>
+          </w:p>
+        </w:tc>
+        <w:tc>
+          <w:tcPr>
+            <w:tcW w:type="dxa" w:w="1377"/>
+          </w:tcPr>
+          <w:p>
+            <w:pPr>
+              <w:spacing w:after="60"/>
+            </w:pPr>
+            <w:r>
+              <w:rPr>
+                <w:b w:val="0"/>
+                <w:sz w:val="17"/>
+              </w:rPr>
+              <w:t>0.3990</w:t>
+            </w:r>
+          </w:p>
+        </w:tc>
+        <w:tc>
+          <w:tcPr>
+            <w:tcW w:type="dxa" w:w="1377"/>
+          </w:tcPr>
+          <w:p>
+            <w:pPr>
+              <w:spacing w:after="60"/>
+            </w:pPr>
+            <w:r>
+              <w:rPr>
+                <w:b w:val="0"/>
+                <w:sz w:val="17"/>
+              </w:rPr>
+              <w:t>0.3709</w:t>
+            </w:r>
+          </w:p>
+        </w:tc>
+        <w:tc>
+          <w:tcPr>
+            <w:tcW w:type="dxa" w:w="1377"/>
+          </w:tcPr>
+          <w:p>
+            <w:pPr>
+              <w:spacing w:after="60"/>
+            </w:pPr>
+            <w:r>
+              <w:rPr>
+                <w:b w:val="0"/>
+                <w:sz w:val="17"/>
+              </w:rPr>
+              <w:t>0.3161</w:t>
+            </w:r>
+          </w:p>
+        </w:tc>
+      </w:tr>
+      <w:tr>
+        <w:trPr>
+          <w:cantSplit/>
+        </w:trPr>
+        <w:tc>
+          <w:tcPr>
+            <w:tcW w:type="dxa" w:w="1377"/>
+          </w:tcPr>
+          <w:p>
+            <w:pPr>
+              <w:spacing w:after="60"/>
+            </w:pPr>
+            <w:r>
+              <w:rPr>
+                <w:b w:val="0"/>
+                <w:sz w:val="17"/>
+              </w:rPr>
+              <w:t>去冗余LightGBM</w:t>
+            </w:r>
+          </w:p>
+        </w:tc>
+        <w:tc>
+          <w:tcPr>
+            <w:tcW w:type="dxa" w:w="1377"/>
+          </w:tcPr>
+          <w:p>
+            <w:pPr>
+              <w:spacing w:after="60"/>
+            </w:pPr>
+            <w:r>
+              <w:rPr>
+                <w:b w:val="0"/>
+                <w:sz w:val="17"/>
+              </w:rPr>
+              <w:t>0.2206</w:t>
+            </w:r>
+          </w:p>
+        </w:tc>
+        <w:tc>
+          <w:tcPr>
+            <w:tcW w:type="dxa" w:w="1377"/>
+          </w:tcPr>
+          <w:p>
+            <w:pPr>
+              <w:spacing w:after="60"/>
+            </w:pPr>
+            <w:r>
+              <w:rPr>
+                <w:b w:val="0"/>
+                <w:sz w:val="17"/>
+              </w:rPr>
+              <w:t>0.3142</w:t>
+            </w:r>
+          </w:p>
+        </w:tc>
+        <w:tc>
+          <w:tcPr>
+            <w:tcW w:type="dxa" w:w="1377"/>
+          </w:tcPr>
+          <w:p>
+            <w:pPr>
+              <w:spacing w:after="60"/>
+            </w:pPr>
+            <w:r>
+              <w:rPr>
+                <w:b w:val="0"/>
+                <w:sz w:val="17"/>
+              </w:rPr>
+              <w:t>0.4013</w:t>
+            </w:r>
+          </w:p>
+        </w:tc>
+        <w:tc>
+          <w:tcPr>
+            <w:tcW w:type="dxa" w:w="1377"/>
+          </w:tcPr>
+          <w:p>
+            <w:pPr>
+              <w:spacing w:after="60"/>
+            </w:pPr>
+            <w:r>
+              <w:rPr>
+                <w:b w:val="0"/>
+                <w:sz w:val="17"/>
+              </w:rPr>
+              <w:t>0.4097</w:t>
+            </w:r>
+          </w:p>
+        </w:tc>
+        <w:tc>
+          <w:tcPr>
+            <w:tcW w:type="dxa" w:w="1377"/>
+          </w:tcPr>
+          <w:p>
+            <w:pPr>
+              <w:spacing w:after="60"/>
+            </w:pPr>
+            <w:r>
+              <w:rPr>
+                <w:b w:val="0"/>
+                <w:sz w:val="17"/>
+              </w:rPr>
+              <w:t>0.4036</w:t>
+            </w:r>
+          </w:p>
+        </w:tc>
+        <w:tc>
+          <w:tcPr>
+            <w:tcW w:type="dxa" w:w="1377"/>
+          </w:tcPr>
+          <w:p>
+            <w:pPr>
+              <w:spacing w:after="60"/>
+            </w:pPr>
+            <w:r>
+              <w:rPr>
+                <w:b w:val="0"/>
+                <w:sz w:val="17"/>
+              </w:rPr>
+              <w:t>0.3873</w:t>
+            </w:r>
+          </w:p>
+        </w:tc>
+      </w:tr>
+    </w:tbl>
+    <w:p>
+      <w:r>
+        <w:rPr>
+          <w:b w:val="0"/>
+        </w:rPr>
+        <w:t>RF：500→2000棵时，CV R²约0.4366→0.4376，变化仅约+0.0010。更多树主要降低随机抽样带来的波动，无法补充缺失的解释变量；该随机种子下50棵的CV均值最高，但其测试R²为0.5380，低于500棵的0.5403。不能据此普遍宣称少树更好。</w:t>
+      </w:r>
+    </w:p>
+    <w:p>
+      <w:r>
+        <w:rPr>
+          <w:b w:val="0"/>
+        </w:rPr>
+        <w:t>原LightGBM：CV在300轮约0.4095，2000轮降至0.3160；去冗余LightGBM在500轮约0.4097，2000轮降至0.3873。提升树继续拟合训练残差，也可能逐步拟合噪声。因此“尚未收敛时增加迭代”和“过拟合后继续增加迭代”应分开判断。</w:t>
+      </w:r>
+    </w:p>
+    <w:p>
+      <w:r>
+        <w:rPr>
+          <w:b w:val="0"/>
+        </w:rPr>
+        <w:t>原LightGBM训练CV选择300轮，测试R²为0.5333，低于原500轮的0.5396。保留这次反例；训练内验证是合理的选型依据，但不能保证某一次固定测试划分必然提高。</w:t>
+      </w:r>
+    </w:p>
+    <w:p>
+      <w:r>
+        <w:br w:type="page"/>
+      </w:r>
+    </w:p>
+    <w:p>
+      <w:pPr>
+        <w:pStyle w:val="Heading1"/>
+      </w:pPr>
+      <w:r>
+        <w:t>补充实验三：删异常值和缩尾的实际结果</w:t>
+      </w:r>
+    </w:p>
+    <w:p>
+      <w:r>
+        <w:rPr>
+          <w:b/>
+        </w:rPr>
+        <w:t>以下“异常”只是统计筛选标签，目前没有经实验记录核实的数据错误。删除规则均只作用于训练子集；273条测试记录全部保留。</w:t>
+      </w:r>
+    </w:p>
+    <w:tbl>
+      <w:tblPr>
+        <w:tblStyle w:val="TableGrid"/>
+        <w:tblW w:type="auto" w:w="0"/>
+        <w:tblLook w:firstColumn="1" w:firstRow="1" w:lastColumn="0" w:lastRow="0" w:noHBand="0" w:noVBand="1" w:val="04A0"/>
+      </w:tblPr>
+      <w:tblGrid>
+        <w:gridCol w:w="2409"/>
+        <w:gridCol w:w="2409"/>
+        <w:gridCol w:w="2409"/>
+        <w:gridCol w:w="2409"/>
+      </w:tblGrid>
+      <w:tr>
+        <w:trPr>
+          <w:tblHeader/>
+          <w:cantSplit/>
+        </w:trPr>
+        <w:tc>
+          <w:tcPr>
+            <w:tcW w:type="dxa" w:w="2409"/>
+          </w:tcPr>
+          <w:p>
+            <w:pPr>
+              <w:spacing w:after="60"/>
+            </w:pPr>
+            <w:r>
+              <w:rPr>
+                <w:b/>
+                <w:sz w:val="17"/>
+              </w:rPr>
+              <w:t>按训练CV选中的规则</w:t>
+            </w:r>
+          </w:p>
+        </w:tc>
+        <w:tc>
+          <w:tcPr>
+            <w:tcW w:type="dxa" w:w="2409"/>
+          </w:tcPr>
+          <w:p>
+            <w:pPr>
+              <w:spacing w:after="60"/>
+            </w:pPr>
+            <w:r>
+              <w:rPr>
+                <w:b/>
+                <w:sz w:val="17"/>
+              </w:rPr>
+              <w:t>CV R² ±折间SD</w:t>
+            </w:r>
+          </w:p>
+        </w:tc>
+        <w:tc>
+          <w:tcPr>
+            <w:tcW w:type="dxa" w:w="2409"/>
+          </w:tcPr>
+          <w:p>
+            <w:pPr>
+              <w:spacing w:after="60"/>
+            </w:pPr>
+            <w:r>
+              <w:rPr>
+                <w:b/>
+                <w:sz w:val="17"/>
+              </w:rPr>
+              <w:t>测试R²</w:t>
+            </w:r>
+          </w:p>
+        </w:tc>
+        <w:tc>
+          <w:tcPr>
+            <w:tcW w:type="dxa" w:w="2409"/>
+          </w:tcPr>
+          <w:p>
+            <w:pPr>
+              <w:spacing w:after="60"/>
+            </w:pPr>
+            <w:r>
+              <w:rPr>
+                <w:b/>
+                <w:sz w:val="17"/>
+              </w:rPr>
+              <w:t>全训练集处理量</w:t>
+            </w:r>
+          </w:p>
+        </w:tc>
+      </w:tr>
+      <w:tr>
+        <w:trPr>
+          <w:cantSplit/>
+        </w:trPr>
+        <w:tc>
+          <w:tcPr>
+            <w:tcW w:type="dxa" w:w="2409"/>
+          </w:tcPr>
+          <w:p>
+            <w:pPr>
+              <w:spacing w:after="60"/>
+            </w:pPr>
+            <w:r>
+              <w:rPr>
+                <w:b w:val="0"/>
+                <w:sz w:val="17"/>
+              </w:rPr>
+              <w:t>不新增处理（RF500）</w:t>
+            </w:r>
+          </w:p>
+        </w:tc>
+        <w:tc>
+          <w:tcPr>
+            <w:tcW w:type="dxa" w:w="2409"/>
+          </w:tcPr>
+          <w:p>
+            <w:pPr>
+              <w:spacing w:after="60"/>
+            </w:pPr>
+            <w:r>
+              <w:rPr>
+                <w:b w:val="0"/>
+                <w:sz w:val="17"/>
+              </w:rPr>
+              <w:t>0.4366 ± 0.0425</w:t>
+            </w:r>
+          </w:p>
+        </w:tc>
+        <w:tc>
+          <w:tcPr>
+            <w:tcW w:type="dxa" w:w="2409"/>
+          </w:tcPr>
+          <w:p>
+            <w:pPr>
+              <w:spacing w:after="60"/>
+            </w:pPr>
+            <w:r>
+              <w:rPr>
+                <w:b w:val="0"/>
+                <w:sz w:val="17"/>
+              </w:rPr>
+              <w:t>0.5403</w:t>
+            </w:r>
+          </w:p>
+        </w:tc>
+        <w:tc>
+          <w:tcPr>
+            <w:tcW w:type="dxa" w:w="2409"/>
+          </w:tcPr>
+          <w:p>
+            <w:pPr>
+              <w:spacing w:after="60"/>
+            </w:pPr>
+            <w:r>
+              <w:rPr>
+                <w:b w:val="0"/>
+                <w:sz w:val="17"/>
+              </w:rPr>
+              <w:t>保留1090</w:t>
+            </w:r>
+          </w:p>
+        </w:tc>
+      </w:tr>
+      <w:tr>
+        <w:trPr>
+          <w:cantSplit/>
+        </w:trPr>
+        <w:tc>
+          <w:tcPr>
+            <w:tcW w:type="dxa" w:w="2409"/>
+          </w:tcPr>
+          <w:p>
+            <w:pPr>
+              <w:spacing w:after="60"/>
+            </w:pPr>
+            <w:r>
+              <w:rPr>
+                <w:b w:val="0"/>
+                <w:sz w:val="17"/>
+              </w:rPr>
+              <w:t>目标双尾剔除1%</w:t>
+            </w:r>
+          </w:p>
+        </w:tc>
+        <w:tc>
+          <w:tcPr>
+            <w:tcW w:type="dxa" w:w="2409"/>
+          </w:tcPr>
+          <w:p>
+            <w:pPr>
+              <w:spacing w:after="60"/>
+            </w:pPr>
+            <w:r>
+              <w:rPr>
+                <w:b w:val="0"/>
+                <w:sz w:val="17"/>
+              </w:rPr>
+              <w:t>0.4445 ± 0.0271</w:t>
+            </w:r>
+          </w:p>
+        </w:tc>
+        <w:tc>
+          <w:tcPr>
+            <w:tcW w:type="dxa" w:w="2409"/>
+          </w:tcPr>
+          <w:p>
+            <w:pPr>
+              <w:spacing w:after="60"/>
+            </w:pPr>
+            <w:r>
+              <w:rPr>
+                <w:b w:val="0"/>
+                <w:sz w:val="17"/>
+              </w:rPr>
+              <w:t>0.5442</w:t>
+            </w:r>
+          </w:p>
+        </w:tc>
+        <w:tc>
+          <w:tcPr>
+            <w:tcW w:type="dxa" w:w="2409"/>
+          </w:tcPr>
+          <w:p>
+            <w:pPr>
+              <w:spacing w:after="60"/>
+            </w:pPr>
+            <w:r>
+              <w:rPr>
+                <w:b w:val="0"/>
+                <w:sz w:val="17"/>
+              </w:rPr>
+              <w:t>删10，保留1080</w:t>
+            </w:r>
+          </w:p>
+        </w:tc>
+      </w:tr>
+      <w:tr>
+        <w:trPr>
+          <w:cantSplit/>
+        </w:trPr>
+        <w:tc>
+          <w:tcPr>
+            <w:tcW w:type="dxa" w:w="2409"/>
+          </w:tcPr>
+          <w:p>
+            <w:pPr>
+              <w:spacing w:after="60"/>
+            </w:pPr>
+            <w:r>
+              <w:rPr>
+                <w:b w:val="0"/>
+                <w:sz w:val="17"/>
+              </w:rPr>
+              <w:t>IsolationForest 1%</w:t>
+            </w:r>
+          </w:p>
+        </w:tc>
+        <w:tc>
+          <w:tcPr>
+            <w:tcW w:type="dxa" w:w="2409"/>
+          </w:tcPr>
+          <w:p>
+            <w:pPr>
+              <w:spacing w:after="60"/>
+            </w:pPr>
+            <w:r>
+              <w:rPr>
+                <w:b w:val="0"/>
+                <w:sz w:val="17"/>
+              </w:rPr>
+              <w:t>0.4441 ± 0.0296</w:t>
+            </w:r>
+          </w:p>
+        </w:tc>
+        <w:tc>
+          <w:tcPr>
+            <w:tcW w:type="dxa" w:w="2409"/>
+          </w:tcPr>
+          <w:p>
+            <w:pPr>
+              <w:spacing w:after="60"/>
+            </w:pPr>
+            <w:r>
+              <w:rPr>
+                <w:b w:val="0"/>
+                <w:sz w:val="17"/>
+              </w:rPr>
+              <w:t>0.5337</w:t>
+            </w:r>
+          </w:p>
+        </w:tc>
+        <w:tc>
+          <w:tcPr>
+            <w:tcW w:type="dxa" w:w="2409"/>
+          </w:tcPr>
+          <w:p>
+            <w:pPr>
+              <w:spacing w:after="60"/>
+            </w:pPr>
+            <w:r>
+              <w:rPr>
+                <w:b w:val="0"/>
+                <w:sz w:val="17"/>
+              </w:rPr>
+              <w:t>删11</w:t>
+            </w:r>
+          </w:p>
+        </w:tc>
+      </w:tr>
+      <w:tr>
+        <w:trPr>
+          <w:cantSplit/>
+        </w:trPr>
+        <w:tc>
+          <w:tcPr>
+            <w:tcW w:type="dxa" w:w="2409"/>
+          </w:tcPr>
+          <w:p>
+            <w:pPr>
+              <w:spacing w:after="60"/>
+            </w:pPr>
+            <w:r>
+              <w:rPr>
+                <w:b w:val="0"/>
+                <w:sz w:val="17"/>
+              </w:rPr>
+              <w:t>OOF绝对残差 1%</w:t>
+            </w:r>
+          </w:p>
+        </w:tc>
+        <w:tc>
+          <w:tcPr>
+            <w:tcW w:type="dxa" w:w="2409"/>
+          </w:tcPr>
+          <w:p>
+            <w:pPr>
+              <w:spacing w:after="60"/>
+            </w:pPr>
+            <w:r>
+              <w:rPr>
+                <w:b w:val="0"/>
+                <w:sz w:val="17"/>
+              </w:rPr>
+              <w:t>0.4429 ± 0.0467</w:t>
+            </w:r>
+          </w:p>
+        </w:tc>
+        <w:tc>
+          <w:tcPr>
+            <w:tcW w:type="dxa" w:w="2409"/>
+          </w:tcPr>
+          <w:p>
+            <w:pPr>
+              <w:spacing w:after="60"/>
+            </w:pPr>
+            <w:r>
+              <w:rPr>
+                <w:b w:val="0"/>
+                <w:sz w:val="17"/>
+              </w:rPr>
+              <w:t>0.5409</w:t>
+            </w:r>
+          </w:p>
+        </w:tc>
+        <w:tc>
+          <w:tcPr>
+            <w:tcW w:type="dxa" w:w="2409"/>
+          </w:tcPr>
+          <w:p>
+            <w:pPr>
+              <w:spacing w:after="60"/>
+            </w:pPr>
+            <w:r>
+              <w:rPr>
+                <w:b w:val="0"/>
+                <w:sz w:val="17"/>
+              </w:rPr>
+              <w:t>删11</w:t>
+            </w:r>
+          </w:p>
+        </w:tc>
+      </w:tr>
+      <w:tr>
+        <w:trPr>
+          <w:cantSplit/>
+        </w:trPr>
+        <w:tc>
+          <w:tcPr>
+            <w:tcW w:type="dxa" w:w="2409"/>
+          </w:tcPr>
+          <w:p>
+            <w:pPr>
+              <w:spacing w:after="60"/>
+            </w:pPr>
+            <w:r>
+              <w:rPr>
+                <w:b w:val="0"/>
+                <w:sz w:val="17"/>
+              </w:rPr>
+              <w:t>目标双尾缩尾2%</w:t>
+            </w:r>
+          </w:p>
+        </w:tc>
+        <w:tc>
+          <w:tcPr>
+            <w:tcW w:type="dxa" w:w="2409"/>
+          </w:tcPr>
+          <w:p>
+            <w:pPr>
+              <w:spacing w:after="60"/>
+            </w:pPr>
+            <w:r>
+              <w:rPr>
+                <w:b w:val="0"/>
+                <w:sz w:val="17"/>
+              </w:rPr>
+              <w:t>0.4384 ± 0.0370</w:t>
+            </w:r>
+          </w:p>
+        </w:tc>
+        <w:tc>
+          <w:tcPr>
+            <w:tcW w:type="dxa" w:w="2409"/>
+          </w:tcPr>
+          <w:p>
+            <w:pPr>
+              <w:spacing w:after="60"/>
+            </w:pPr>
+            <w:r>
+              <w:rPr>
+                <w:b w:val="0"/>
+                <w:sz w:val="17"/>
+              </w:rPr>
+              <w:t>0.5355</w:t>
+            </w:r>
+          </w:p>
+        </w:tc>
+        <w:tc>
+          <w:tcPr>
+            <w:tcW w:type="dxa" w:w="2409"/>
+          </w:tcPr>
+          <w:p>
+            <w:pPr>
+              <w:spacing w:after="60"/>
+            </w:pPr>
+            <w:r>
+              <w:rPr>
+                <w:b w:val="0"/>
+                <w:sz w:val="17"/>
+              </w:rPr>
+              <w:t>不删，改20个训练目标</w:t>
+            </w:r>
+          </w:p>
+        </w:tc>
+      </w:tr>
+    </w:tbl>
+    <w:p>
+      <w:r>
+        <w:drawing>
+          <wp:inline xmlns:a="http://schemas.openxmlformats.org/drawingml/2006/main" xmlns:pic="http://schemas.openxmlformats.org/drawingml/2006/picture">
+            <wp:extent cx="5112000" cy="2442400"/>
+            <wp:docPr id="9" name="Picture 9"/>
+            <wp:cNvGraphicFramePr>
+              <a:graphicFrameLocks noChangeAspect="1"/>
+            </wp:cNvGraphicFramePr>
+            <a:graphic>
+              <a:graphicData uri="http://schemas.openxmlformats.org/drawingml/2006/picture">
+                <pic:pic>
+                  <pic:nvPicPr>
+                    <pic:cNvPr id="0" name="outlier_sensitivity.png"/>
+                    <pic:cNvPicPr/>
+                  </pic:nvPicPr>
+                  <pic:blipFill>
+                    <a:blip r:embed="rId19"/>
+                    <a:stretch>
+                      <a:fillRect/>
+                    </a:stretch>
+                  </pic:blipFill>
+                  <pic:spPr>
+                    <a:xfrm>
+                      <a:off x="0" y="0"/>
+                      <a:ext cx="5112000" cy="2442400"/>
+                    </a:xfrm>
+                    <a:prstGeom prst="rect"/>
+                  </pic:spPr>
+                </pic:pic>
+              </a:graphicData>
+            </a:graphic>
+          </wp:inline>
+        </w:drawing>
+      </w:r>
+    </w:p>
+    <w:p>
+      <w:r>
+        <w:rPr>
+          <w:b w:val="0"/>
+        </w:rPr>
+        <w:t>图含全部12种处理强度及对照；none_0为不新增处理。更激进的处理通常退化，例如目标双尾剔除5%的CV R²降至0.3597，不能靠多删样本稳定提高分数。</w:t>
+      </w:r>
+    </w:p>
+    <w:p>
+      <w:r>
+        <w:br w:type="page"/>
+      </w:r>
+    </w:p>
+    <w:p>
+      <w:pPr>
+        <w:pStyle w:val="Heading1"/>
+      </w:pPr>
+      <w:r>
+        <w:t>补充实验四：完整结果和新增删样本清单</w:t>
+      </w:r>
+    </w:p>
+    <w:tbl>
+      <w:tblPr>
+        <w:tblStyle w:val="TableGrid"/>
+        <w:tblW w:type="auto" w:w="0"/>
+        <w:tblLook w:firstColumn="1" w:firstRow="1" w:lastColumn="0" w:lastRow="0" w:noHBand="0" w:noVBand="1" w:val="04A0"/>
+      </w:tblPr>
+      <w:tblGrid>
+        <w:gridCol w:w="2409"/>
+        <w:gridCol w:w="2409"/>
+        <w:gridCol w:w="2409"/>
+        <w:gridCol w:w="2409"/>
+      </w:tblGrid>
+      <w:tr>
+        <w:trPr>
+          <w:tblHeader/>
+          <w:cantSplit/>
+        </w:trPr>
+        <w:tc>
+          <w:tcPr>
+            <w:tcW w:type="dxa" w:w="2409"/>
+          </w:tcPr>
+          <w:p>
+            <w:pPr>
+              <w:spacing w:after="60"/>
+            </w:pPr>
+            <w:r>
+              <w:rPr>
+                <w:b/>
+                <w:sz w:val="17"/>
+              </w:rPr>
+              <w:t>候选（各类别训练CV选中）</w:t>
+            </w:r>
+          </w:p>
+        </w:tc>
+        <w:tc>
+          <w:tcPr>
+            <w:tcW w:type="dxa" w:w="2409"/>
+          </w:tcPr>
+          <w:p>
+            <w:pPr>
+              <w:spacing w:after="60"/>
+            </w:pPr>
+            <w:r>
+              <w:rPr>
+                <w:b/>
+                <w:sz w:val="17"/>
+              </w:rPr>
+              <w:t>CV R²</w:t>
+            </w:r>
+          </w:p>
+        </w:tc>
+        <w:tc>
+          <w:tcPr>
+            <w:tcW w:type="dxa" w:w="2409"/>
+          </w:tcPr>
+          <w:p>
+            <w:pPr>
+              <w:spacing w:after="60"/>
+            </w:pPr>
+            <w:r>
+              <w:rPr>
+                <w:b/>
+                <w:sz w:val="17"/>
+              </w:rPr>
+              <w:t>测试R²</w:t>
+            </w:r>
+          </w:p>
+        </w:tc>
+        <w:tc>
+          <w:tcPr>
+            <w:tcW w:type="dxa" w:w="2409"/>
+          </w:tcPr>
+          <w:p>
+            <w:pPr>
+              <w:spacing w:after="60"/>
+            </w:pPr>
+            <w:r>
+              <w:rPr>
+                <w:b/>
+                <w:sz w:val="17"/>
+              </w:rPr>
+              <w:t>相对RF500 Δ</w:t>
+            </w:r>
+          </w:p>
+        </w:tc>
+      </w:tr>
+      <w:tr>
+        <w:trPr>
+          <w:cantSplit/>
+        </w:trPr>
+        <w:tc>
+          <w:tcPr>
+            <w:tcW w:type="dxa" w:w="2409"/>
+          </w:tcPr>
+          <w:p>
+            <w:pPr>
+              <w:spacing w:after="60"/>
+            </w:pPr>
+            <w:r>
+              <w:rPr>
+                <w:b w:val="0"/>
+                <w:sz w:val="17"/>
+              </w:rPr>
+              <w:t>RF50 训练CV选中</w:t>
+            </w:r>
+          </w:p>
+        </w:tc>
+        <w:tc>
+          <w:tcPr>
+            <w:tcW w:type="dxa" w:w="2409"/>
+          </w:tcPr>
+          <w:p>
+            <w:pPr>
+              <w:spacing w:after="60"/>
+            </w:pPr>
+            <w:r>
+              <w:rPr>
+                <w:b w:val="0"/>
+                <w:sz w:val="17"/>
+              </w:rPr>
+              <w:t>0.4419</w:t>
+            </w:r>
+          </w:p>
+        </w:tc>
+        <w:tc>
+          <w:tcPr>
+            <w:tcW w:type="dxa" w:w="2409"/>
+          </w:tcPr>
+          <w:p>
+            <w:pPr>
+              <w:spacing w:after="60"/>
+            </w:pPr>
+            <w:r>
+              <w:rPr>
+                <w:b w:val="0"/>
+                <w:sz w:val="17"/>
+              </w:rPr>
+              <w:t>0.5380</w:t>
+            </w:r>
+          </w:p>
+        </w:tc>
+        <w:tc>
+          <w:tcPr>
+            <w:tcW w:type="dxa" w:w="2409"/>
+          </w:tcPr>
+          <w:p>
+            <w:pPr>
+              <w:spacing w:after="60"/>
+            </w:pPr>
+            <w:r>
+              <w:rPr>
+                <w:b w:val="0"/>
+                <w:sz w:val="17"/>
+              </w:rPr>
+              <w:t>-0.0023</w:t>
+            </w:r>
+          </w:p>
+        </w:tc>
+      </w:tr>
+      <w:tr>
+        <w:trPr>
+          <w:cantSplit/>
+        </w:trPr>
+        <w:tc>
+          <w:tcPr>
+            <w:tcW w:type="dxa" w:w="2409"/>
+          </w:tcPr>
+          <w:p>
+            <w:pPr>
+              <w:spacing w:after="60"/>
+            </w:pPr>
+            <w:r>
+              <w:rPr>
+                <w:b w:val="0"/>
+                <w:sz w:val="17"/>
+              </w:rPr>
+              <w:t>原LightGBM：300轮</w:t>
+            </w:r>
+          </w:p>
+        </w:tc>
+        <w:tc>
+          <w:tcPr>
+            <w:tcW w:type="dxa" w:w="2409"/>
+          </w:tcPr>
+          <w:p>
+            <w:pPr>
+              <w:spacing w:after="60"/>
+            </w:pPr>
+            <w:r>
+              <w:rPr>
+                <w:b w:val="0"/>
+                <w:sz w:val="17"/>
+              </w:rPr>
+              <w:t>0.4095</w:t>
+            </w:r>
+          </w:p>
+        </w:tc>
+        <w:tc>
+          <w:tcPr>
+            <w:tcW w:type="dxa" w:w="2409"/>
+          </w:tcPr>
+          <w:p>
+            <w:pPr>
+              <w:spacing w:after="60"/>
+            </w:pPr>
+            <w:r>
+              <w:rPr>
+                <w:b w:val="0"/>
+                <w:sz w:val="17"/>
+              </w:rPr>
+              <w:t>0.5333</w:t>
+            </w:r>
+          </w:p>
+        </w:tc>
+        <w:tc>
+          <w:tcPr>
+            <w:tcW w:type="dxa" w:w="2409"/>
+          </w:tcPr>
+          <w:p>
+            <w:pPr>
+              <w:spacing w:after="60"/>
+            </w:pPr>
+            <w:r>
+              <w:rPr>
+                <w:b w:val="0"/>
+                <w:sz w:val="17"/>
+              </w:rPr>
+              <w:t>-0.0070</w:t>
+            </w:r>
+          </w:p>
+        </w:tc>
+      </w:tr>
+      <w:tr>
+        <w:trPr>
+          <w:cantSplit/>
+        </w:trPr>
+        <w:tc>
+          <w:tcPr>
+            <w:tcW w:type="dxa" w:w="2409"/>
+          </w:tcPr>
+          <w:p>
+            <w:pPr>
+              <w:spacing w:after="60"/>
+            </w:pPr>
+            <w:r>
+              <w:rPr>
+                <w:b w:val="0"/>
+                <w:sz w:val="17"/>
+              </w:rPr>
+              <w:t>去冗余LightGBM：500轮</w:t>
+            </w:r>
+          </w:p>
+        </w:tc>
+        <w:tc>
+          <w:tcPr>
+            <w:tcW w:type="dxa" w:w="2409"/>
+          </w:tcPr>
+          <w:p>
+            <w:pPr>
+              <w:spacing w:after="60"/>
+            </w:pPr>
+            <w:r>
+              <w:rPr>
+                <w:b w:val="0"/>
+                <w:sz w:val="17"/>
+              </w:rPr>
+              <w:t>0.4097</w:t>
+            </w:r>
+          </w:p>
+        </w:tc>
+        <w:tc>
+          <w:tcPr>
+            <w:tcW w:type="dxa" w:w="2409"/>
+          </w:tcPr>
+          <w:p>
+            <w:pPr>
+              <w:spacing w:after="60"/>
+            </w:pPr>
+            <w:r>
+              <w:rPr>
+                <w:b w:val="0"/>
+                <w:sz w:val="17"/>
+              </w:rPr>
+              <w:t>0.4851</w:t>
+            </w:r>
+          </w:p>
+        </w:tc>
+        <w:tc>
+          <w:tcPr>
+            <w:tcW w:type="dxa" w:w="2409"/>
+          </w:tcPr>
+          <w:p>
+            <w:pPr>
+              <w:spacing w:after="60"/>
+            </w:pPr>
+            <w:r>
+              <w:rPr>
+                <w:b w:val="0"/>
+                <w:sz w:val="17"/>
+              </w:rPr>
+              <w:t>-0.0552</w:t>
+            </w:r>
+          </w:p>
+        </w:tc>
+      </w:tr>
+      <w:tr>
+        <w:trPr>
+          <w:cantSplit/>
+        </w:trPr>
+        <w:tc>
+          <w:tcPr>
+            <w:tcW w:type="dxa" w:w="2409"/>
+          </w:tcPr>
+          <w:p>
+            <w:pPr>
+              <w:spacing w:after="60"/>
+            </w:pPr>
+            <w:r>
+              <w:rPr>
+                <w:b w:val="0"/>
+                <w:sz w:val="17"/>
+              </w:rPr>
+              <w:t>训练目标双尾剔除1%</w:t>
+            </w:r>
+          </w:p>
+        </w:tc>
+        <w:tc>
+          <w:tcPr>
+            <w:tcW w:type="dxa" w:w="2409"/>
+          </w:tcPr>
+          <w:p>
+            <w:pPr>
+              <w:spacing w:after="60"/>
+            </w:pPr>
+            <w:r>
+              <w:rPr>
+                <w:b w:val="0"/>
+                <w:sz w:val="17"/>
+              </w:rPr>
+              <w:t>0.4445</w:t>
+            </w:r>
+          </w:p>
+        </w:tc>
+        <w:tc>
+          <w:tcPr>
+            <w:tcW w:type="dxa" w:w="2409"/>
+          </w:tcPr>
+          <w:p>
+            <w:pPr>
+              <w:spacing w:after="60"/>
+            </w:pPr>
+            <w:r>
+              <w:rPr>
+                <w:b w:val="0"/>
+                <w:sz w:val="17"/>
+              </w:rPr>
+              <w:t>0.5442</w:t>
+            </w:r>
+          </w:p>
+        </w:tc>
+        <w:tc>
+          <w:tcPr>
+            <w:tcW w:type="dxa" w:w="2409"/>
+          </w:tcPr>
+          <w:p>
+            <w:pPr>
+              <w:spacing w:after="60"/>
+            </w:pPr>
+            <w:r>
+              <w:rPr>
+                <w:b w:val="0"/>
+                <w:sz w:val="17"/>
+              </w:rPr>
+              <w:t>+0.0039</w:t>
+            </w:r>
+          </w:p>
+        </w:tc>
+      </w:tr>
+      <w:tr>
+        <w:trPr>
+          <w:cantSplit/>
+        </w:trPr>
+        <w:tc>
+          <w:tcPr>
+            <w:tcW w:type="dxa" w:w="2409"/>
+          </w:tcPr>
+          <w:p>
+            <w:pPr>
+              <w:spacing w:after="60"/>
+            </w:pPr>
+            <w:r>
+              <w:rPr>
+                <w:b w:val="0"/>
+                <w:sz w:val="17"/>
+              </w:rPr>
+              <w:t>训练目标双尾缩尾2%</w:t>
+            </w:r>
+          </w:p>
+        </w:tc>
+        <w:tc>
+          <w:tcPr>
+            <w:tcW w:type="dxa" w:w="2409"/>
+          </w:tcPr>
+          <w:p>
+            <w:pPr>
+              <w:spacing w:after="60"/>
+            </w:pPr>
+            <w:r>
+              <w:rPr>
+                <w:b w:val="0"/>
+                <w:sz w:val="17"/>
+              </w:rPr>
+              <w:t>0.4384</w:t>
+            </w:r>
+          </w:p>
+        </w:tc>
+        <w:tc>
+          <w:tcPr>
+            <w:tcW w:type="dxa" w:w="2409"/>
+          </w:tcPr>
+          <w:p>
+            <w:pPr>
+              <w:spacing w:after="60"/>
+            </w:pPr>
+            <w:r>
+              <w:rPr>
+                <w:b w:val="0"/>
+                <w:sz w:val="17"/>
+              </w:rPr>
+              <w:t>0.5355</w:t>
+            </w:r>
+          </w:p>
+        </w:tc>
+        <w:tc>
+          <w:tcPr>
+            <w:tcW w:type="dxa" w:w="2409"/>
+          </w:tcPr>
+          <w:p>
+            <w:pPr>
+              <w:spacing w:after="60"/>
+            </w:pPr>
+            <w:r>
+              <w:rPr>
+                <w:b w:val="0"/>
+                <w:sz w:val="17"/>
+              </w:rPr>
+              <w:t>-0.0048</w:t>
+            </w:r>
+          </w:p>
+        </w:tc>
+      </w:tr>
+      <w:tr>
+        <w:trPr>
+          <w:cantSplit/>
+        </w:trPr>
+        <w:tc>
+          <w:tcPr>
+            <w:tcW w:type="dxa" w:w="2409"/>
+          </w:tcPr>
+          <w:p>
+            <w:pPr>
+              <w:spacing w:after="60"/>
+            </w:pPr>
+            <w:r>
+              <w:rPr>
+                <w:b w:val="0"/>
+                <w:sz w:val="17"/>
+              </w:rPr>
+              <w:t>IsolationForest 筛除1%</w:t>
+            </w:r>
+          </w:p>
+        </w:tc>
+        <w:tc>
+          <w:tcPr>
+            <w:tcW w:type="dxa" w:w="2409"/>
+          </w:tcPr>
+          <w:p>
+            <w:pPr>
+              <w:spacing w:after="60"/>
+            </w:pPr>
+            <w:r>
+              <w:rPr>
+                <w:b w:val="0"/>
+                <w:sz w:val="17"/>
+              </w:rPr>
+              <w:t>0.4441</w:t>
+            </w:r>
+          </w:p>
+        </w:tc>
+        <w:tc>
+          <w:tcPr>
+            <w:tcW w:type="dxa" w:w="2409"/>
+          </w:tcPr>
+          <w:p>
+            <w:pPr>
+              <w:spacing w:after="60"/>
+            </w:pPr>
+            <w:r>
+              <w:rPr>
+                <w:b w:val="0"/>
+                <w:sz w:val="17"/>
+              </w:rPr>
+              <w:t>0.5337</w:t>
+            </w:r>
+          </w:p>
+        </w:tc>
+        <w:tc>
+          <w:tcPr>
+            <w:tcW w:type="dxa" w:w="2409"/>
+          </w:tcPr>
+          <w:p>
+            <w:pPr>
+              <w:spacing w:after="60"/>
+            </w:pPr>
+            <w:r>
+              <w:rPr>
+                <w:b w:val="0"/>
+                <w:sz w:val="17"/>
+              </w:rPr>
+              <w:t>-0.0067</w:t>
+            </w:r>
+          </w:p>
+        </w:tc>
+      </w:tr>
+      <w:tr>
+        <w:trPr>
+          <w:cantSplit/>
+        </w:trPr>
+        <w:tc>
+          <w:tcPr>
+            <w:tcW w:type="dxa" w:w="2409"/>
+          </w:tcPr>
+          <w:p>
+            <w:pPr>
+              <w:spacing w:after="60"/>
+            </w:pPr>
+            <w:r>
+              <w:rPr>
+                <w:b w:val="0"/>
+                <w:sz w:val="17"/>
+              </w:rPr>
+              <w:t>OOF残差筛除1%</w:t>
+            </w:r>
+          </w:p>
+        </w:tc>
+        <w:tc>
+          <w:tcPr>
+            <w:tcW w:type="dxa" w:w="2409"/>
+          </w:tcPr>
+          <w:p>
+            <w:pPr>
+              <w:spacing w:after="60"/>
+            </w:pPr>
+            <w:r>
+              <w:rPr>
+                <w:b w:val="0"/>
+                <w:sz w:val="17"/>
+              </w:rPr>
+              <w:t>0.4429</w:t>
+            </w:r>
+          </w:p>
+        </w:tc>
+        <w:tc>
+          <w:tcPr>
+            <w:tcW w:type="dxa" w:w="2409"/>
+          </w:tcPr>
+          <w:p>
+            <w:pPr>
+              <w:spacing w:after="60"/>
+            </w:pPr>
+            <w:r>
+              <w:rPr>
+                <w:b w:val="0"/>
+                <w:sz w:val="17"/>
+              </w:rPr>
+              <w:t>0.5409</w:t>
+            </w:r>
+          </w:p>
+        </w:tc>
+        <w:tc>
+          <w:tcPr>
+            <w:tcW w:type="dxa" w:w="2409"/>
+          </w:tcPr>
+          <w:p>
+            <w:pPr>
+              <w:spacing w:after="60"/>
+            </w:pPr>
+            <w:r>
+              <w:rPr>
+                <w:b w:val="0"/>
+                <w:sz w:val="17"/>
+              </w:rPr>
+              <w:t>+0.0005</w:t>
+            </w:r>
+          </w:p>
+        </w:tc>
+      </w:tr>
+      <w:tr>
+        <w:trPr>
+          <w:cantSplit/>
+        </w:trPr>
+        <w:tc>
+          <w:tcPr>
+            <w:tcW w:type="dxa" w:w="2409"/>
+          </w:tcPr>
+          <w:p>
+            <w:pPr>
+              <w:spacing w:after="60"/>
+            </w:pPr>
+            <w:r>
+              <w:rPr>
+                <w:b w:val="0"/>
+                <w:sz w:val="17"/>
+              </w:rPr>
+              <w:t>梯度提升 Huber损失</w:t>
+            </w:r>
+          </w:p>
+        </w:tc>
+        <w:tc>
+          <w:tcPr>
+            <w:tcW w:type="dxa" w:w="2409"/>
+          </w:tcPr>
+          <w:p>
+            <w:pPr>
+              <w:spacing w:after="60"/>
+            </w:pPr>
+            <w:r>
+              <w:rPr>
+                <w:b w:val="0"/>
+                <w:sz w:val="17"/>
+              </w:rPr>
+              <w:t>0.3970</w:t>
+            </w:r>
+          </w:p>
+        </w:tc>
+        <w:tc>
+          <w:tcPr>
+            <w:tcW w:type="dxa" w:w="2409"/>
+          </w:tcPr>
+          <w:p>
+            <w:pPr>
+              <w:spacing w:after="60"/>
+            </w:pPr>
+            <w:r>
+              <w:rPr>
+                <w:b w:val="0"/>
+                <w:sz w:val="17"/>
+              </w:rPr>
+              <w:t>0.5240</w:t>
+            </w:r>
+          </w:p>
+        </w:tc>
+        <w:tc>
+          <w:tcPr>
+            <w:tcW w:type="dxa" w:w="2409"/>
+          </w:tcPr>
+          <w:p>
+            <w:pPr>
+              <w:spacing w:after="60"/>
+            </w:pPr>
+            <w:r>
+              <w:rPr>
+                <w:b w:val="0"/>
+                <w:sz w:val="17"/>
+              </w:rPr>
+              <w:t>-0.0163</w:t>
+            </w:r>
+          </w:p>
+        </w:tc>
+      </w:tr>
+      <w:tr>
+        <w:trPr>
+          <w:cantSplit/>
+        </w:trPr>
+        <w:tc>
+          <w:tcPr>
+            <w:tcW w:type="dxa" w:w="2409"/>
+          </w:tcPr>
+          <w:p>
+            <w:pPr>
+              <w:spacing w:after="60"/>
+            </w:pPr>
+            <w:r>
+              <w:rPr>
+                <w:b w:val="0"/>
+                <w:sz w:val="17"/>
+              </w:rPr>
+              <w:t>匹配梯度提升 平方损失</w:t>
+            </w:r>
+          </w:p>
+        </w:tc>
+        <w:tc>
+          <w:tcPr>
+            <w:tcW w:type="dxa" w:w="2409"/>
+          </w:tcPr>
+          <w:p>
+            <w:pPr>
+              <w:spacing w:after="60"/>
+            </w:pPr>
+            <w:r>
+              <w:rPr>
+                <w:b w:val="0"/>
+                <w:sz w:val="17"/>
+              </w:rPr>
+              <w:t>0.3918</w:t>
+            </w:r>
+          </w:p>
+        </w:tc>
+        <w:tc>
+          <w:tcPr>
+            <w:tcW w:type="dxa" w:w="2409"/>
+          </w:tcPr>
+          <w:p>
+            <w:pPr>
+              <w:spacing w:after="60"/>
+            </w:pPr>
+            <w:r>
+              <w:rPr>
+                <w:b w:val="0"/>
+                <w:sz w:val="17"/>
+              </w:rPr>
+              <w:t>0.5363</w:t>
+            </w:r>
+          </w:p>
+        </w:tc>
+        <w:tc>
+          <w:tcPr>
+            <w:tcW w:type="dxa" w:w="2409"/>
+          </w:tcPr>
+          <w:p>
+            <w:pPr>
+              <w:spacing w:after="60"/>
+            </w:pPr>
+            <w:r>
+              <w:rPr>
+                <w:b w:val="0"/>
+                <w:sz w:val="17"/>
+              </w:rPr>
+              <w:t>-0.0040</w:t>
+            </w:r>
+          </w:p>
+        </w:tc>
+      </w:tr>
+      <w:tr>
+        <w:trPr>
+          <w:cantSplit/>
+        </w:trPr>
+        <w:tc>
+          <w:tcPr>
+            <w:tcW w:type="dxa" w:w="2409"/>
+          </w:tcPr>
+          <w:p>
+            <w:pPr>
+              <w:spacing w:after="60"/>
+            </w:pPr>
+            <w:r>
+              <w:rPr>
+                <w:b w:val="0"/>
+                <w:sz w:val="17"/>
+              </w:rPr>
+              <w:t>RF500 对照</w:t>
+            </w:r>
+          </w:p>
+        </w:tc>
+        <w:tc>
+          <w:tcPr>
+            <w:tcW w:type="dxa" w:w="2409"/>
+          </w:tcPr>
+          <w:p>
+            <w:pPr>
+              <w:spacing w:after="60"/>
+            </w:pPr>
+            <w:r>
+              <w:rPr>
+                <w:b w:val="0"/>
+                <w:sz w:val="17"/>
+              </w:rPr>
+              <w:t>0.4366</w:t>
+            </w:r>
+          </w:p>
+        </w:tc>
+        <w:tc>
+          <w:tcPr>
+            <w:tcW w:type="dxa" w:w="2409"/>
+          </w:tcPr>
+          <w:p>
+            <w:pPr>
+              <w:spacing w:after="60"/>
+            </w:pPr>
+            <w:r>
+              <w:rPr>
+                <w:b w:val="0"/>
+                <w:sz w:val="17"/>
+              </w:rPr>
+              <w:t>0.5403</w:t>
+            </w:r>
+          </w:p>
+        </w:tc>
+        <w:tc>
+          <w:tcPr>
+            <w:tcW w:type="dxa" w:w="2409"/>
+          </w:tcPr>
+          <w:p>
+            <w:pPr>
+              <w:spacing w:after="60"/>
+            </w:pPr>
+            <w:r>
+              <w:rPr>
+                <w:b w:val="0"/>
+                <w:sz w:val="17"/>
+              </w:rPr>
+              <w:t>+0.0000</w:t>
+            </w:r>
+          </w:p>
+        </w:tc>
+      </w:tr>
+      <w:tr>
+        <w:trPr>
+          <w:cantSplit/>
+        </w:trPr>
+        <w:tc>
+          <w:tcPr>
+            <w:tcW w:type="dxa" w:w="2409"/>
+          </w:tcPr>
+          <w:p>
+            <w:pPr>
+              <w:spacing w:after="60"/>
+            </w:pPr>
+            <w:r>
+              <w:rPr>
+                <w:b w:val="0"/>
+                <w:sz w:val="17"/>
+              </w:rPr>
+              <w:t>RF/SVR 各50%平均</w:t>
+            </w:r>
+          </w:p>
+        </w:tc>
+        <w:tc>
+          <w:tcPr>
+            <w:tcW w:type="dxa" w:w="2409"/>
+          </w:tcPr>
+          <w:p>
+            <w:pPr>
+              <w:spacing w:after="60"/>
+            </w:pPr>
+            <w:r>
+              <w:rPr>
+                <w:b w:val="0"/>
+                <w:sz w:val="17"/>
+              </w:rPr>
+              <w:t>0.4525</w:t>
+            </w:r>
+          </w:p>
+        </w:tc>
+        <w:tc>
+          <w:tcPr>
+            <w:tcW w:type="dxa" w:w="2409"/>
+          </w:tcPr>
+          <w:p>
+            <w:pPr>
+              <w:spacing w:after="60"/>
+            </w:pPr>
+            <w:r>
+              <w:rPr>
+                <w:b w:val="0"/>
+                <w:sz w:val="17"/>
+              </w:rPr>
+              <w:t>0.5432</w:t>
+            </w:r>
+          </w:p>
+        </w:tc>
+        <w:tc>
+          <w:tcPr>
+            <w:tcW w:type="dxa" w:w="2409"/>
+          </w:tcPr>
+          <w:p>
+            <w:pPr>
+              <w:spacing w:after="60"/>
+            </w:pPr>
+            <w:r>
+              <w:rPr>
+                <w:b w:val="0"/>
+                <w:sz w:val="17"/>
+              </w:rPr>
+              <w:t>+0.0029</w:t>
+            </w:r>
+          </w:p>
+        </w:tc>
+      </w:tr>
+    </w:tbl>
+    <w:p>
+      <w:r>
+        <w:rPr>
+          <w:b w:val="0"/>
+        </w:rPr>
+        <w:t>Huber最佳训练CV约0.3970，匹配平方损失约0.3918；对应测试分别0.5240、0.5363，均低于RF500。Huber对大残差降低权重可能改善稳健性，但R²使用平方误差评价，二者优化目标并不完全相同。不能保证稳健损失使R²提高。</w:t>
+      </w:r>
+    </w:p>
+    <w:p>
+      <w:r>
+        <w:rPr>
+          <w:b w:val="0"/>
+        </w:rPr>
+        <w:t>简单平均：训练CV从RF的0.4366升至0.4525，折间SD从0.0425降至0.0298；测试仅从0.5403升至0.5432，MAE从0.5738降至0.5638。它没有新增删除样本，但需要训练两个模型，也使单一模型的重要性解释更复杂。</w:t>
+      </w:r>
+    </w:p>
+    <w:p>
+      <w:r>
+        <w:rPr>
+          <w:b w:val="0"/>
+        </w:rPr>
+        <w:t>目标双尾剔除1%的实际规则：在1090条训练样本的ln(1+Li)上取0.5%和99.5%分位点，低于下界或高于上界才剔除（边界并列保留）。换回原浓度，下界约0.2、上界约655.531；因此实际删10条，并非强制凑11条。</w:t>
+      </w:r>
+    </w:p>
+    <w:p>
+      <w:r>
+        <w:rPr>
+          <w:b w:val="0"/>
+        </w:rPr>
+        <w:t>原QSH Excel行号→Li：3→720；64→799；271→977；327→0；328→0；331→0；333→0；1284→660；1287→740；1288→820。其中4条为0，6条为660–977。零值可能涉及检出限或真实低值，高值也可能具有研究意义；这些解释尚未经来源记录核实。</w:t>
+      </w:r>
+    </w:p>
+    <w:p>
+      <w:r>
+        <w:rPr>
+          <w:b w:val="0"/>
+        </w:rPr>
+        <w:t>本轮最高观测测试R²=0.5442来自上述删尾部敏感性方案。相对原RF实跑0.5390总共约+0.0052，相对前次修改RF0.5403约+0.0039，不能称为明显突破，更不能把它视为删错值已得到证实。</w:t>
+      </w:r>
+    </w:p>
+    <w:p>
+      <w:r>
+        <w:br w:type="page"/>
+      </w:r>
+    </w:p>
+    <w:p>
+      <w:pPr>
+        <w:pStyle w:val="Heading1"/>
+      </w:pPr>
+      <w:r>
+        <w:t>补充结论：瓶颈证据、推荐与组会表述</w:t>
+      </w:r>
+    </w:p>
+    <w:p>
+      <w:r>
+        <w:rPr>
+          <w:b/>
+        </w:rPr>
+        <w:t>已核实的事实</w:t>
+      </w:r>
+    </w:p>
+    <w:p>
+      <w:r>
+        <w:rPr>
+          <w:b w:val="0"/>
+        </w:rPr>
+        <w:t>① 23列中有18列提供完全线性重复的信息，去冗余后是6个独立数值方向，不能将列数当作独立信息量。② 气候变量之间高度相关。③ 存在完全相同输入对应不同Li的记录，例如原Excel行1289与1296，全部23个输入相同，Li却为10和450。④ 多类模型及本轮迭代／稳健／筛样本实验仍集中在相近的测试R²附近。</w:t>
+      </w:r>
+    </w:p>
+    <w:p>
+      <w:r>
+        <w:rPr>
+          <w:b w:val="0"/>
+        </w:rPr>
+        <w:t>上述事实支持“当前输入信息及数据质量值得优先核查”的判断，但不能证明0.54是数学上限。相同输入不同输出只说明这些记录无法被仅依赖当前X的确定性模型同时精确拟合。该冲突究竟来自未观测地质、水化学、采样层位/时间等因素，还是环境栅格分辨率、字段提取、单位或记录误差，需要进一步证据。候选缺失因素是待核实解释，当前数据无法确定其贡献。</w:t>
+      </w:r>
+    </w:p>
+    <w:p>
+      <w:r>
+        <w:rPr>
+          <w:b/>
+        </w:rPr>
+        <w:t>下一步的实际优先级</w:t>
+      </w:r>
+    </w:p>
+    <w:p>
+      <w:r>
+        <w:rPr>
+          <w:b w:val="0"/>
+        </w:rPr>
+        <w:t>优先核对18个重复字段的原始提取过程及单位、零值与高值的实验记录、重复环境输入对应不同Li的采样条件。若原始信息有误，修复后重新建模；若存在真实差异，再考虑补充有物理依据且预测时可取得的变量。收集与核实数据有时间成本，应先查可疑字段，再决定是否做更多调参。</w:t>
+      </w:r>
+    </w:p>
+    <w:p>
+      <w:r>
+        <w:rPr>
+          <w:b w:val="0"/>
+        </w:rPr>
+        <w:t>当前建议：主分析保留不新增删样本的RF及已有完整结果；0.5442删尾部模型作为敏感性分析，RF/SVR平均作为预测补充。不要为追分数直接把它们替换成最终物理影响结论。若要给组合模型报告因子重要性，应重新对组合预测函数评价，不能直接平均两个模型的原始重要性数值。</w:t>
+      </w:r>
+    </w:p>
+    <w:p>
+      <w:r>
+        <w:rPr>
+          <w:b w:val="0"/>
+        </w:rPr>
+        <w:t>验证限制：本测试集已在此前开发中多次查看，属于内部开发验证。本轮虽然没有用测试分数选参数，也没有删除测试点，但持续试验仍可能产生选择乐观；小幅增益需要新样本或预先固定的独立验证确认。此处未做可支持“统计显著提升”的独立检验。没有证据保证R²能达到0.7或0.8，也没有证据证明继续研究一定无效。</w:t>
+      </w:r>
+    </w:p>
+    <w:p>
+      <w:r>
+        <w:rPr>
+          <w:b w:val="0"/>
+        </w:rPr>
+        <w:t>组会可直接表述：“我们没有把目前R²当作上限。本轮增加了迭代曲线、稳健损失、训练内异常样本处理和简单集成；完整测试集仍保留273条。最高观测R²为0.5442，但依赖删去训练尾部10条记录；不新增删样本的集成为0.5432。增益都很小，下一阶段应优先核查重复字段及同输入不同Li的来源，而不是保证通过加迭代或删点实现大幅提升。”</w:t>
+      </w:r>
+    </w:p>
+    <w:p>
+      <w:r>
+        <w:rPr>
+          <w:b w:val="0"/>
+        </w:rPr>
+        <w:t>复现：additional_experiments/frozen_data.npz保存清洗后数组、固定划分与源Excel行号。安装父目录requirements.txt后，执行python run_additional.py及python ensemble_check.py即可重跑本轮；frozen_data来自原QSH及原清洗规则，源文件哈希见主目录source_manifest.json。全部逐折记录与删样本行号保留；models/缓存不属于交付必需文件。</w:t>
       </w:r>
     </w:p>
     <w:sectPr>

</xml_diff>

<commit_message>
Evaluate RF feature counts and training-only four-feature subset
</commit_message>
<xml_diff>
--- a/li-concentration-regression/Li_group_meeting_report.docx
+++ b/li-concentration-regression/Li_group_meeting_report.docx
@@ -11580,6 +11580,1543 @@
           <w:b w:val="0"/>
         </w:rPr>
         <w:t>复现：additional_experiments/frozen_data.npz保存清洗后数组、固定划分与源Excel行号。安装父目录requirements.txt后，执行python run_additional.py及python ensemble_check.py即可重跑本轮；frozen_data来自原QSH及原清洗规则，源文件哈希见主目录source_manifest.json。全部逐折记录与删样本行号保留；models/缓存不属于交付必需文件。</w:t>
+      </w:r>
+    </w:p>
+    <w:p>
+      <w:r>
+        <w:br w:type="page"/>
+      </w:r>
+    </w:p>
+    <w:p>
+      <w:pPr>
+        <w:pStyle w:val="Heading1"/>
+      </w:pPr>
+      <w:r>
+        <w:t>变量筛选一：是否需要保留全部23列？</w:t>
+      </w:r>
+    </w:p>
+    <w:p>
+      <w:r>
+        <w:rPr>
+          <w:b/>
+        </w:rPr>
+        <w:t>结论：不需要机械保留全部23列，但“重要性前6／7列”不等于6个非重复信息组。进一步删变量能否提高R²，需要训练内选择与完整测试对照。</w:t>
+      </w:r>
+    </w:p>
+    <w:p>
+      <w:r>
+        <w:rPr>
+          <w:b w:val="0"/>
+        </w:rPr>
+        <w:t>当前23列中，18列提供完全线性重复信息，分别是CECS、CECT、SpH、SOC、SCF、SSiF、SSaF、SGC、TCF、TSiF、TSaF、TGC、OAR、SNRC、SNA、TpH、TOC、ST。合并后保留CECS作为共享代表，以及AET、AI、Alpha(AET/PET)、PET、BIO7，共6个非重复组。这只是数值信息的去重复，不是确认18项物理作用相同，也不表示其余5项相互独立。</w:t>
+      </w:r>
+    </w:p>
+    <w:p>
+      <w:r>
+        <w:rPr>
+          <w:b w:val="0"/>
+        </w:rPr>
+        <w:t>第7列必然来自现有信息的重复表示。它可能改变随机森林选特征时的权重和数值路径，但不提供第7类新的数据信息。不能把6→7列的偶然分数变化解释为获得新机制。</w:t>
+      </w:r>
+    </w:p>
+    <w:tbl>
+      <w:tblPr>
+        <w:tblStyle w:val="TableGrid"/>
+        <w:tblW w:type="auto" w:w="0"/>
+        <w:tblLook w:firstColumn="1" w:firstRow="1" w:lastColumn="0" w:lastRow="0" w:noHBand="0" w:noVBand="1" w:val="04A0"/>
+      </w:tblPr>
+      <w:tblGrid>
+        <w:gridCol w:w="2409"/>
+        <w:gridCol w:w="2409"/>
+        <w:gridCol w:w="2409"/>
+        <w:gridCol w:w="2409"/>
+      </w:tblGrid>
+      <w:tr>
+        <w:trPr>
+          <w:tblHeader/>
+          <w:cantSplit/>
+        </w:trPr>
+        <w:tc>
+          <w:tcPr>
+            <w:tcW w:type="dxa" w:w="2409"/>
+          </w:tcPr>
+          <w:p>
+            <w:pPr>
+              <w:spacing w:after="60"/>
+            </w:pPr>
+            <w:r>
+              <w:rPr>
+                <w:b/>
+                <w:sz w:val="17"/>
+              </w:rPr>
+              <w:t>对照</w:t>
+            </w:r>
+          </w:p>
+        </w:tc>
+        <w:tc>
+          <w:tcPr>
+            <w:tcW w:type="dxa" w:w="2409"/>
+          </w:tcPr>
+          <w:p>
+            <w:pPr>
+              <w:spacing w:after="60"/>
+            </w:pPr>
+            <w:r>
+              <w:rPr>
+                <w:b/>
+                <w:sz w:val="17"/>
+              </w:rPr>
+              <w:t>列数</w:t>
+            </w:r>
+          </w:p>
+        </w:tc>
+        <w:tc>
+          <w:tcPr>
+            <w:tcW w:type="dxa" w:w="2409"/>
+          </w:tcPr>
+          <w:p>
+            <w:pPr>
+              <w:spacing w:after="60"/>
+            </w:pPr>
+            <w:r>
+              <w:rPr>
+                <w:b/>
+                <w:sz w:val="17"/>
+              </w:rPr>
+              <w:t>训练CV R²</w:t>
+            </w:r>
+          </w:p>
+        </w:tc>
+        <w:tc>
+          <w:tcPr>
+            <w:tcW w:type="dxa" w:w="2409"/>
+          </w:tcPr>
+          <w:p>
+            <w:pPr>
+              <w:spacing w:after="60"/>
+            </w:pPr>
+            <w:r>
+              <w:rPr>
+                <w:b/>
+                <w:sz w:val="17"/>
+              </w:rPr>
+              <w:t>测试R²</w:t>
+            </w:r>
+          </w:p>
+        </w:tc>
+      </w:tr>
+      <w:tr>
+        <w:trPr>
+          <w:cantSplit/>
+        </w:trPr>
+        <w:tc>
+          <w:tcPr>
+            <w:tcW w:type="dxa" w:w="2409"/>
+          </w:tcPr>
+          <w:p>
+            <w:pPr>
+              <w:spacing w:after="60"/>
+            </w:pPr>
+            <w:r>
+              <w:rPr>
+                <w:b w:val="0"/>
+                <w:sz w:val="17"/>
+              </w:rPr>
+              <w:t>原RF：23列</w:t>
+            </w:r>
+          </w:p>
+        </w:tc>
+        <w:tc>
+          <w:tcPr>
+            <w:tcW w:type="dxa" w:w="2409"/>
+          </w:tcPr>
+          <w:p>
+            <w:pPr>
+              <w:spacing w:after="60"/>
+            </w:pPr>
+            <w:r>
+              <w:rPr>
+                <w:b w:val="0"/>
+                <w:sz w:val="17"/>
+              </w:rPr>
+              <w:t>23</w:t>
+            </w:r>
+          </w:p>
+        </w:tc>
+        <w:tc>
+          <w:tcPr>
+            <w:tcW w:type="dxa" w:w="2409"/>
+          </w:tcPr>
+          <w:p>
+            <w:pPr>
+              <w:spacing w:after="60"/>
+            </w:pPr>
+            <w:r>
+              <w:rPr>
+                <w:b w:val="0"/>
+                <w:sz w:val="17"/>
+              </w:rPr>
+              <w:t>0.4112</w:t>
+            </w:r>
+          </w:p>
+        </w:tc>
+        <w:tc>
+          <w:tcPr>
+            <w:tcW w:type="dxa" w:w="2409"/>
+          </w:tcPr>
+          <w:p>
+            <w:pPr>
+              <w:spacing w:after="60"/>
+            </w:pPr>
+            <w:r>
+              <w:rPr>
+                <w:b w:val="0"/>
+                <w:sz w:val="17"/>
+              </w:rPr>
+              <w:t>0.5390</w:t>
+            </w:r>
+          </w:p>
+        </w:tc>
+      </w:tr>
+      <w:tr>
+        <w:trPr>
+          <w:cantSplit/>
+        </w:trPr>
+        <w:tc>
+          <w:tcPr>
+            <w:tcW w:type="dxa" w:w="2409"/>
+          </w:tcPr>
+          <w:p>
+            <w:pPr>
+              <w:spacing w:after="60"/>
+            </w:pPr>
+            <w:r>
+              <w:rPr>
+                <w:b w:val="0"/>
+                <w:sz w:val="17"/>
+              </w:rPr>
+              <w:t>修改RF参数：23列</w:t>
+            </w:r>
+          </w:p>
+        </w:tc>
+        <w:tc>
+          <w:tcPr>
+            <w:tcW w:type="dxa" w:w="2409"/>
+          </w:tcPr>
+          <w:p>
+            <w:pPr>
+              <w:spacing w:after="60"/>
+            </w:pPr>
+            <w:r>
+              <w:rPr>
+                <w:b w:val="0"/>
+                <w:sz w:val="17"/>
+              </w:rPr>
+              <w:t>23</w:t>
+            </w:r>
+          </w:p>
+        </w:tc>
+        <w:tc>
+          <w:tcPr>
+            <w:tcW w:type="dxa" w:w="2409"/>
+          </w:tcPr>
+          <w:p>
+            <w:pPr>
+              <w:spacing w:after="60"/>
+            </w:pPr>
+            <w:r>
+              <w:rPr>
+                <w:b w:val="0"/>
+                <w:sz w:val="17"/>
+              </w:rPr>
+              <w:t>0.4225</w:t>
+            </w:r>
+          </w:p>
+        </w:tc>
+        <w:tc>
+          <w:tcPr>
+            <w:tcW w:type="dxa" w:w="2409"/>
+          </w:tcPr>
+          <w:p>
+            <w:pPr>
+              <w:spacing w:after="60"/>
+            </w:pPr>
+            <w:r>
+              <w:rPr>
+                <w:b w:val="0"/>
+                <w:sz w:val="17"/>
+              </w:rPr>
+              <w:t>0.5434</w:t>
+            </w:r>
+          </w:p>
+        </w:tc>
+      </w:tr>
+      <w:tr>
+        <w:trPr>
+          <w:cantSplit/>
+        </w:trPr>
+        <w:tc>
+          <w:tcPr>
+            <w:tcW w:type="dxa" w:w="2409"/>
+          </w:tcPr>
+          <w:p>
+            <w:pPr>
+              <w:spacing w:after="60"/>
+            </w:pPr>
+            <w:r>
+              <w:rPr>
+                <w:b w:val="0"/>
+                <w:sz w:val="17"/>
+              </w:rPr>
+              <w:t>训练内重要性前6列：原RF参数</w:t>
+            </w:r>
+          </w:p>
+        </w:tc>
+        <w:tc>
+          <w:tcPr>
+            <w:tcW w:type="dxa" w:w="2409"/>
+          </w:tcPr>
+          <w:p>
+            <w:pPr>
+              <w:spacing w:after="60"/>
+            </w:pPr>
+            <w:r>
+              <w:rPr>
+                <w:b w:val="0"/>
+                <w:sz w:val="17"/>
+              </w:rPr>
+              <w:t>6</w:t>
+            </w:r>
+          </w:p>
+        </w:tc>
+        <w:tc>
+          <w:tcPr>
+            <w:tcW w:type="dxa" w:w="2409"/>
+          </w:tcPr>
+          <w:p>
+            <w:pPr>
+              <w:spacing w:after="60"/>
+            </w:pPr>
+            <w:r>
+              <w:rPr>
+                <w:b w:val="0"/>
+                <w:sz w:val="17"/>
+              </w:rPr>
+              <w:t>0.4095</w:t>
+            </w:r>
+          </w:p>
+        </w:tc>
+        <w:tc>
+          <w:tcPr>
+            <w:tcW w:type="dxa" w:w="2409"/>
+          </w:tcPr>
+          <w:p>
+            <w:pPr>
+              <w:spacing w:after="60"/>
+            </w:pPr>
+            <w:r>
+              <w:rPr>
+                <w:b w:val="0"/>
+                <w:sz w:val="17"/>
+              </w:rPr>
+              <w:t>0.5403</w:t>
+            </w:r>
+          </w:p>
+        </w:tc>
+      </w:tr>
+      <w:tr>
+        <w:trPr>
+          <w:cantSplit/>
+        </w:trPr>
+        <w:tc>
+          <w:tcPr>
+            <w:tcW w:type="dxa" w:w="2409"/>
+          </w:tcPr>
+          <w:p>
+            <w:pPr>
+              <w:spacing w:after="60"/>
+            </w:pPr>
+            <w:r>
+              <w:rPr>
+                <w:b w:val="0"/>
+                <w:sz w:val="17"/>
+              </w:rPr>
+              <w:t>训练内重要性前7列：原RF参数</w:t>
+            </w:r>
+          </w:p>
+        </w:tc>
+        <w:tc>
+          <w:tcPr>
+            <w:tcW w:type="dxa" w:w="2409"/>
+          </w:tcPr>
+          <w:p>
+            <w:pPr>
+              <w:spacing w:after="60"/>
+            </w:pPr>
+            <w:r>
+              <w:rPr>
+                <w:b w:val="0"/>
+                <w:sz w:val="17"/>
+              </w:rPr>
+              <w:t>7</w:t>
+            </w:r>
+          </w:p>
+        </w:tc>
+        <w:tc>
+          <w:tcPr>
+            <w:tcW w:type="dxa" w:w="2409"/>
+          </w:tcPr>
+          <w:p>
+            <w:pPr>
+              <w:spacing w:after="60"/>
+            </w:pPr>
+            <w:r>
+              <w:rPr>
+                <w:b w:val="0"/>
+                <w:sz w:val="17"/>
+              </w:rPr>
+              <w:t>0.4093</w:t>
+            </w:r>
+          </w:p>
+        </w:tc>
+        <w:tc>
+          <w:tcPr>
+            <w:tcW w:type="dxa" w:w="2409"/>
+          </w:tcPr>
+          <w:p>
+            <w:pPr>
+              <w:spacing w:after="60"/>
+            </w:pPr>
+            <w:r>
+              <w:rPr>
+                <w:b w:val="0"/>
+                <w:sz w:val="17"/>
+              </w:rPr>
+              <w:t>0.5393</w:t>
+            </w:r>
+          </w:p>
+        </w:tc>
+      </w:tr>
+      <w:tr>
+        <w:trPr>
+          <w:cantSplit/>
+        </w:trPr>
+        <w:tc>
+          <w:tcPr>
+            <w:tcW w:type="dxa" w:w="2409"/>
+          </w:tcPr>
+          <w:p>
+            <w:pPr>
+              <w:spacing w:after="60"/>
+            </w:pPr>
+            <w:r>
+              <w:rPr>
+                <w:b w:val="0"/>
+                <w:sz w:val="17"/>
+              </w:rPr>
+              <w:t>修改RF：6个非重复信息组</w:t>
+            </w:r>
+          </w:p>
+        </w:tc>
+        <w:tc>
+          <w:tcPr>
+            <w:tcW w:type="dxa" w:w="2409"/>
+          </w:tcPr>
+          <w:p>
+            <w:pPr>
+              <w:spacing w:after="60"/>
+            </w:pPr>
+            <w:r>
+              <w:rPr>
+                <w:b w:val="0"/>
+                <w:sz w:val="17"/>
+              </w:rPr>
+              <w:t>6</w:t>
+            </w:r>
+          </w:p>
+        </w:tc>
+        <w:tc>
+          <w:tcPr>
+            <w:tcW w:type="dxa" w:w="2409"/>
+          </w:tcPr>
+          <w:p>
+            <w:pPr>
+              <w:spacing w:after="60"/>
+            </w:pPr>
+            <w:r>
+              <w:rPr>
+                <w:b w:val="0"/>
+                <w:sz w:val="17"/>
+              </w:rPr>
+              <w:t>0.4366</w:t>
+            </w:r>
+          </w:p>
+        </w:tc>
+        <w:tc>
+          <w:tcPr>
+            <w:tcW w:type="dxa" w:w="2409"/>
+          </w:tcPr>
+          <w:p>
+            <w:pPr>
+              <w:spacing w:after="60"/>
+            </w:pPr>
+            <w:r>
+              <w:rPr>
+                <w:b w:val="0"/>
+                <w:sz w:val="17"/>
+              </w:rPr>
+              <w:t>0.5403</w:t>
+            </w:r>
+          </w:p>
+        </w:tc>
+      </w:tr>
+    </w:tbl>
+    <w:p>
+      <w:r>
+        <w:rPr>
+          <w:b w:val="0"/>
+        </w:rPr>
+        <w:t>原参数对照：23列、前6列、前7列均使用原RF的1000棵树、深度10、叶节点最少3条。修改参数对照：23列与去重复6组均使用500棵树、深度8、max_features=0.3、ccp_alpha=0.001。这样将变量处理与算法参数变化分开记录。</w:t>
+      </w:r>
+    </w:p>
+    <w:p>
+      <w:r>
+        <w:rPr>
+          <w:b w:val="0"/>
+        </w:rPr>
+        <w:t>此前图中的重要性使用过测试数据，不能再直接据其挑列。本轮对每个训练折另做80/20内部分割：在内层训练拟合原RF，在内层验证做10次置换排名；选前6或7列后，重新用整个外层训练折拟合，外层验证不参与排名。最终列名也只由1090条训练数据的内部划分确定。</w:t>
+      </w:r>
+    </w:p>
+    <w:p>
+      <w:r>
+        <w:rPr>
+          <w:b w:val="0"/>
+        </w:rPr>
+        <w:t>全部训练数据内最终前6列：PET、AET、AI、BIO7、Alpha(AET/PET)、SOC；第7列为SSiF。这些是本次数值排名，不是物理影响强弱的最终定论。</w:t>
+      </w:r>
+    </w:p>
+    <w:p>
+      <w:r>
+        <w:br w:type="page"/>
+      </w:r>
+    </w:p>
+    <w:p>
+      <w:pPr>
+        <w:pStyle w:val="Heading1"/>
+      </w:pPr>
+      <w:r>
+        <w:t>变量筛选二：保留1–6组的实际对照</w:t>
+      </w:r>
+    </w:p>
+    <w:tbl>
+      <w:tblPr>
+        <w:tblStyle w:val="TableGrid"/>
+        <w:tblW w:type="auto" w:w="0"/>
+        <w:tblLook w:firstColumn="1" w:firstRow="1" w:lastColumn="0" w:lastRow="0" w:noHBand="0" w:noVBand="1" w:val="04A0"/>
+      </w:tblPr>
+      <w:tblGrid>
+        <w:gridCol w:w="2409"/>
+        <w:gridCol w:w="2409"/>
+        <w:gridCol w:w="2409"/>
+        <w:gridCol w:w="2409"/>
+      </w:tblGrid>
+      <w:tr>
+        <w:trPr>
+          <w:tblHeader/>
+          <w:cantSplit/>
+        </w:trPr>
+        <w:tc>
+          <w:tcPr>
+            <w:tcW w:type="dxa" w:w="2409"/>
+          </w:tcPr>
+          <w:p>
+            <w:pPr>
+              <w:spacing w:after="60"/>
+            </w:pPr>
+            <w:r>
+              <w:rPr>
+                <w:b/>
+                <w:sz w:val="17"/>
+              </w:rPr>
+              <w:t>组数</w:t>
+            </w:r>
+          </w:p>
+        </w:tc>
+        <w:tc>
+          <w:tcPr>
+            <w:tcW w:type="dxa" w:w="2409"/>
+          </w:tcPr>
+          <w:p>
+            <w:pPr>
+              <w:spacing w:after="60"/>
+            </w:pPr>
+            <w:r>
+              <w:rPr>
+                <w:b/>
+                <w:sz w:val="17"/>
+              </w:rPr>
+              <w:t>该组数下训练CV选中的变量</w:t>
+            </w:r>
+          </w:p>
+        </w:tc>
+        <w:tc>
+          <w:tcPr>
+            <w:tcW w:type="dxa" w:w="2409"/>
+          </w:tcPr>
+          <w:p>
+            <w:pPr>
+              <w:spacing w:after="60"/>
+            </w:pPr>
+            <w:r>
+              <w:rPr>
+                <w:b/>
+                <w:sz w:val="17"/>
+              </w:rPr>
+              <w:t>CV R²</w:t>
+            </w:r>
+          </w:p>
+        </w:tc>
+        <w:tc>
+          <w:tcPr>
+            <w:tcW w:type="dxa" w:w="2409"/>
+          </w:tcPr>
+          <w:p>
+            <w:pPr>
+              <w:spacing w:after="60"/>
+            </w:pPr>
+            <w:r>
+              <w:rPr>
+                <w:b/>
+                <w:sz w:val="17"/>
+              </w:rPr>
+              <w:t>测试R²</w:t>
+            </w:r>
+          </w:p>
+        </w:tc>
+      </w:tr>
+      <w:tr>
+        <w:trPr>
+          <w:cantSplit/>
+        </w:trPr>
+        <w:tc>
+          <w:tcPr>
+            <w:tcW w:type="dxa" w:w="2409"/>
+          </w:tcPr>
+          <w:p>
+            <w:pPr>
+              <w:spacing w:after="60"/>
+            </w:pPr>
+            <w:r>
+              <w:rPr>
+                <w:b w:val="0"/>
+                <w:sz w:val="17"/>
+              </w:rPr>
+              <w:t>1</w:t>
+            </w:r>
+          </w:p>
+        </w:tc>
+        <w:tc>
+          <w:tcPr>
+            <w:tcW w:type="dxa" w:w="2409"/>
+          </w:tcPr>
+          <w:p>
+            <w:pPr>
+              <w:spacing w:after="60"/>
+            </w:pPr>
+            <w:r>
+              <w:rPr>
+                <w:b w:val="0"/>
+                <w:sz w:val="17"/>
+              </w:rPr>
+              <w:t>AET</w:t>
+            </w:r>
+          </w:p>
+        </w:tc>
+        <w:tc>
+          <w:tcPr>
+            <w:tcW w:type="dxa" w:w="2409"/>
+          </w:tcPr>
+          <w:p>
+            <w:pPr>
+              <w:spacing w:after="60"/>
+            </w:pPr>
+            <w:r>
+              <w:rPr>
+                <w:b w:val="0"/>
+                <w:sz w:val="17"/>
+              </w:rPr>
+              <w:t>0.4031</w:t>
+            </w:r>
+          </w:p>
+        </w:tc>
+        <w:tc>
+          <w:tcPr>
+            <w:tcW w:type="dxa" w:w="2409"/>
+          </w:tcPr>
+          <w:p>
+            <w:pPr>
+              <w:spacing w:after="60"/>
+            </w:pPr>
+            <w:r>
+              <w:rPr>
+                <w:b w:val="0"/>
+                <w:sz w:val="17"/>
+              </w:rPr>
+              <w:t>0.4898</w:t>
+            </w:r>
+          </w:p>
+        </w:tc>
+      </w:tr>
+      <w:tr>
+        <w:trPr>
+          <w:cantSplit/>
+        </w:trPr>
+        <w:tc>
+          <w:tcPr>
+            <w:tcW w:type="dxa" w:w="2409"/>
+          </w:tcPr>
+          <w:p>
+            <w:pPr>
+              <w:spacing w:after="60"/>
+            </w:pPr>
+            <w:r>
+              <w:rPr>
+                <w:b w:val="0"/>
+                <w:sz w:val="17"/>
+              </w:rPr>
+              <w:t>2</w:t>
+            </w:r>
+          </w:p>
+        </w:tc>
+        <w:tc>
+          <w:tcPr>
+            <w:tcW w:type="dxa" w:w="2409"/>
+          </w:tcPr>
+          <w:p>
+            <w:pPr>
+              <w:spacing w:after="60"/>
+            </w:pPr>
+            <w:r>
+              <w:rPr>
+                <w:b w:val="0"/>
+                <w:sz w:val="17"/>
+              </w:rPr>
+              <w:t>AET、Alpha(AET/PET)</w:t>
+            </w:r>
+          </w:p>
+        </w:tc>
+        <w:tc>
+          <w:tcPr>
+            <w:tcW w:type="dxa" w:w="2409"/>
+          </w:tcPr>
+          <w:p>
+            <w:pPr>
+              <w:spacing w:after="60"/>
+            </w:pPr>
+            <w:r>
+              <w:rPr>
+                <w:b w:val="0"/>
+                <w:sz w:val="17"/>
+              </w:rPr>
+              <w:t>0.4414</w:t>
+            </w:r>
+          </w:p>
+        </w:tc>
+        <w:tc>
+          <w:tcPr>
+            <w:tcW w:type="dxa" w:w="2409"/>
+          </w:tcPr>
+          <w:p>
+            <w:pPr>
+              <w:spacing w:after="60"/>
+            </w:pPr>
+            <w:r>
+              <w:rPr>
+                <w:b w:val="0"/>
+                <w:sz w:val="17"/>
+              </w:rPr>
+              <w:t>0.5195</w:t>
+            </w:r>
+          </w:p>
+        </w:tc>
+      </w:tr>
+      <w:tr>
+        <w:trPr>
+          <w:cantSplit/>
+        </w:trPr>
+        <w:tc>
+          <w:tcPr>
+            <w:tcW w:type="dxa" w:w="2409"/>
+          </w:tcPr>
+          <w:p>
+            <w:pPr>
+              <w:spacing w:after="60"/>
+            </w:pPr>
+            <w:r>
+              <w:rPr>
+                <w:b w:val="0"/>
+                <w:sz w:val="17"/>
+              </w:rPr>
+              <w:t>3</w:t>
+            </w:r>
+          </w:p>
+        </w:tc>
+        <w:tc>
+          <w:tcPr>
+            <w:tcW w:type="dxa" w:w="2409"/>
+          </w:tcPr>
+          <w:p>
+            <w:pPr>
+              <w:spacing w:after="60"/>
+            </w:pPr>
+            <w:r>
+              <w:rPr>
+                <w:b w:val="0"/>
+                <w:sz w:val="17"/>
+              </w:rPr>
+              <w:t>AET、AI、Alpha(AET/PET)</w:t>
+            </w:r>
+          </w:p>
+        </w:tc>
+        <w:tc>
+          <w:tcPr>
+            <w:tcW w:type="dxa" w:w="2409"/>
+          </w:tcPr>
+          <w:p>
+            <w:pPr>
+              <w:spacing w:after="60"/>
+            </w:pPr>
+            <w:r>
+              <w:rPr>
+                <w:b w:val="0"/>
+                <w:sz w:val="17"/>
+              </w:rPr>
+              <w:t>0.4489</w:t>
+            </w:r>
+          </w:p>
+        </w:tc>
+        <w:tc>
+          <w:tcPr>
+            <w:tcW w:type="dxa" w:w="2409"/>
+          </w:tcPr>
+          <w:p>
+            <w:pPr>
+              <w:spacing w:after="60"/>
+            </w:pPr>
+            <w:r>
+              <w:rPr>
+                <w:b w:val="0"/>
+                <w:sz w:val="17"/>
+              </w:rPr>
+              <w:t>0.5511</w:t>
+            </w:r>
+          </w:p>
+        </w:tc>
+      </w:tr>
+      <w:tr>
+        <w:trPr>
+          <w:cantSplit/>
+        </w:trPr>
+        <w:tc>
+          <w:tcPr>
+            <w:tcW w:type="dxa" w:w="2409"/>
+          </w:tcPr>
+          <w:p>
+            <w:pPr>
+              <w:spacing w:after="60"/>
+            </w:pPr>
+            <w:r>
+              <w:rPr>
+                <w:b w:val="0"/>
+                <w:sz w:val="17"/>
+              </w:rPr>
+              <w:t>4</w:t>
+            </w:r>
+          </w:p>
+        </w:tc>
+        <w:tc>
+          <w:tcPr>
+            <w:tcW w:type="dxa" w:w="2409"/>
+          </w:tcPr>
+          <w:p>
+            <w:pPr>
+              <w:spacing w:after="60"/>
+            </w:pPr>
+            <w:r>
+              <w:rPr>
+                <w:b w:val="0"/>
+                <w:sz w:val="17"/>
+              </w:rPr>
+              <w:t>AET、AI、Alpha(AET/PET)、BIO7</w:t>
+            </w:r>
+          </w:p>
+        </w:tc>
+        <w:tc>
+          <w:tcPr>
+            <w:tcW w:type="dxa" w:w="2409"/>
+          </w:tcPr>
+          <w:p>
+            <w:pPr>
+              <w:spacing w:after="60"/>
+            </w:pPr>
+            <w:r>
+              <w:rPr>
+                <w:b w:val="0"/>
+                <w:sz w:val="17"/>
+              </w:rPr>
+              <w:t>0.4503</w:t>
+            </w:r>
+          </w:p>
+        </w:tc>
+        <w:tc>
+          <w:tcPr>
+            <w:tcW w:type="dxa" w:w="2409"/>
+          </w:tcPr>
+          <w:p>
+            <w:pPr>
+              <w:spacing w:after="60"/>
+            </w:pPr>
+            <w:r>
+              <w:rPr>
+                <w:b w:val="0"/>
+                <w:sz w:val="17"/>
+              </w:rPr>
+              <w:t>0.5538</w:t>
+            </w:r>
+          </w:p>
+        </w:tc>
+      </w:tr>
+      <w:tr>
+        <w:trPr>
+          <w:cantSplit/>
+        </w:trPr>
+        <w:tc>
+          <w:tcPr>
+            <w:tcW w:type="dxa" w:w="2409"/>
+          </w:tcPr>
+          <w:p>
+            <w:pPr>
+              <w:spacing w:after="60"/>
+            </w:pPr>
+            <w:r>
+              <w:rPr>
+                <w:b w:val="0"/>
+                <w:sz w:val="17"/>
+              </w:rPr>
+              <w:t>5</w:t>
+            </w:r>
+          </w:p>
+        </w:tc>
+        <w:tc>
+          <w:tcPr>
+            <w:tcW w:type="dxa" w:w="2409"/>
+          </w:tcPr>
+          <w:p>
+            <w:pPr>
+              <w:spacing w:after="60"/>
+            </w:pPr>
+            <w:r>
+              <w:rPr>
+                <w:b w:val="0"/>
+                <w:sz w:val="17"/>
+              </w:rPr>
+              <w:t>CECS、AET、AI、Alpha(AET/PET)、BIO7</w:t>
+            </w:r>
+          </w:p>
+        </w:tc>
+        <w:tc>
+          <w:tcPr>
+            <w:tcW w:type="dxa" w:w="2409"/>
+          </w:tcPr>
+          <w:p>
+            <w:pPr>
+              <w:spacing w:after="60"/>
+            </w:pPr>
+            <w:r>
+              <w:rPr>
+                <w:b w:val="0"/>
+                <w:sz w:val="17"/>
+              </w:rPr>
+              <w:t>0.4442</w:t>
+            </w:r>
+          </w:p>
+        </w:tc>
+        <w:tc>
+          <w:tcPr>
+            <w:tcW w:type="dxa" w:w="2409"/>
+          </w:tcPr>
+          <w:p>
+            <w:pPr>
+              <w:spacing w:after="60"/>
+            </w:pPr>
+            <w:r>
+              <w:rPr>
+                <w:b w:val="0"/>
+                <w:sz w:val="17"/>
+              </w:rPr>
+              <w:t>0.5459</w:t>
+            </w:r>
+          </w:p>
+        </w:tc>
+      </w:tr>
+      <w:tr>
+        <w:trPr>
+          <w:cantSplit/>
+        </w:trPr>
+        <w:tc>
+          <w:tcPr>
+            <w:tcW w:type="dxa" w:w="2409"/>
+          </w:tcPr>
+          <w:p>
+            <w:pPr>
+              <w:spacing w:after="60"/>
+            </w:pPr>
+            <w:r>
+              <w:rPr>
+                <w:b w:val="0"/>
+                <w:sz w:val="17"/>
+              </w:rPr>
+              <w:t>6</w:t>
+            </w:r>
+          </w:p>
+        </w:tc>
+        <w:tc>
+          <w:tcPr>
+            <w:tcW w:type="dxa" w:w="2409"/>
+          </w:tcPr>
+          <w:p>
+            <w:pPr>
+              <w:spacing w:after="60"/>
+            </w:pPr>
+            <w:r>
+              <w:rPr>
+                <w:b w:val="0"/>
+                <w:sz w:val="17"/>
+              </w:rPr>
+              <w:t>CECS、AET、AI、Alpha(AET/PET)、PET、BIO7</w:t>
+            </w:r>
+          </w:p>
+        </w:tc>
+        <w:tc>
+          <w:tcPr>
+            <w:tcW w:type="dxa" w:w="2409"/>
+          </w:tcPr>
+          <w:p>
+            <w:pPr>
+              <w:spacing w:after="60"/>
+            </w:pPr>
+            <w:r>
+              <w:rPr>
+                <w:b w:val="0"/>
+                <w:sz w:val="17"/>
+              </w:rPr>
+              <w:t>0.4366</w:t>
+            </w:r>
+          </w:p>
+        </w:tc>
+        <w:tc>
+          <w:tcPr>
+            <w:tcW w:type="dxa" w:w="2409"/>
+          </w:tcPr>
+          <w:p>
+            <w:pPr>
+              <w:spacing w:after="60"/>
+            </w:pPr>
+            <w:r>
+              <w:rPr>
+                <w:b w:val="0"/>
+                <w:sz w:val="17"/>
+              </w:rPr>
+              <w:t>0.5403</w:t>
+            </w:r>
+          </w:p>
+        </w:tc>
+      </w:tr>
+    </w:tbl>
+    <w:p>
+      <w:r>
+        <w:drawing>
+          <wp:inline xmlns:a="http://schemas.openxmlformats.org/drawingml/2006/main" xmlns:pic="http://schemas.openxmlformats.org/drawingml/2006/picture">
+            <wp:extent cx="5580000" cy="2232000"/>
+            <wp:docPr id="10" name="Picture 10"/>
+            <wp:cNvGraphicFramePr>
+              <a:graphicFrameLocks noChangeAspect="1"/>
+            </wp:cNvGraphicFramePr>
+            <a:graphic>
+              <a:graphicData uri="http://schemas.openxmlformats.org/drawingml/2006/picture">
+                <pic:pic>
+                  <pic:nvPicPr>
+                    <pic:cNvPr id="0" name="feature_count_comparison.png"/>
+                    <pic:cNvPicPr/>
+                  </pic:nvPicPr>
+                  <pic:blipFill>
+                    <a:blip r:embed="rId20"/>
+                    <a:stretch>
+                      <a:fillRect/>
+                    </a:stretch>
+                  </pic:blipFill>
+                  <pic:spPr>
+                    <a:xfrm>
+                      <a:off x="0" y="0"/>
+                      <a:ext cx="5580000" cy="2232000"/>
+                    </a:xfrm>
+                    <a:prstGeom prst="rect"/>
+                  </pic:spPr>
+                </pic:pic>
+              </a:graphicData>
+            </a:graphic>
+          </wp:inline>
+        </w:drawing>
+      </w:r>
+    </w:p>
+    <w:p>
+      <w:r>
+        <w:rPr>
+          <w:b w:val="0"/>
+        </w:rPr>
+        <w:t>图中每个组数只显示该组数下训练CV均值最高的组合；误差线为五折标准差，不是置信区间。最终模型按训练CV选择，不按测试曲线峰值回选。</w:t>
+      </w:r>
+    </w:p>
+    <w:p>
+      <w:r>
+        <w:rPr>
+          <w:b w:val="0"/>
+        </w:rPr>
+        <w:t>训练CV总体选中：AET、AI、Alpha(AET/PET)、BIO7，共4组。训练CV R²=0.4503，测试R²=0.5538；相对6组RF测试R²=0.5403，变化+0.0135。</w:t>
+      </w:r>
+    </w:p>
+    <w:p>
+      <w:r>
+        <w:rPr>
+          <w:b w:val="0"/>
+        </w:rPr>
+        <w:t>本轮枚举6组的全部63个非空组合，每组固定已有修改RF参数，不额外重调深度或树数。加上4个原始列对照，共67种方案、335个外层验证分数；按相同五折训练CV选定每个组数及总体方案，再评价原273条测试样本。未新增删除任何训练或测试记录。</w:t>
+      </w:r>
+    </w:p>
+    <w:p>
+      <w:r>
+        <w:rPr>
+          <w:b w:val="0"/>
+        </w:rPr>
+        <w:t>由于特征数变化，max_features=0.3对应的候选列数也可能变化；删除重复表示还会改变某类信息被树节点抽中的机会。因此即使数值信息没有减少，RF预测仍可能改变。</w:t>
+      </w:r>
+    </w:p>
+    <w:p>
+      <w:r>
+        <w:br w:type="page"/>
+      </w:r>
+    </w:p>
+    <w:p>
+      <w:pPr>
+        <w:pStyle w:val="Heading1"/>
+      </w:pPr>
+      <w:r>
+        <w:t>变量筛选三：解释、限制与组会建议</w:t>
+      </w:r>
+    </w:p>
+    <w:p>
+      <w:r>
+        <w:rPr>
+          <w:b/>
+        </w:rPr>
+        <w:t>为什么不能简单按重要性排名删变量？</w:t>
+      </w:r>
+    </w:p>
+    <w:p>
+      <w:r>
+        <w:rPr>
+          <w:b w:val="0"/>
+        </w:rPr>
+        <w:t>高度相关或重复的变量可以互相替代，单列置换重要性容易被分摊或压低；单看排名可能重复选中同一信息，也可能漏掉有互补作用的变量。变量在单独使用时弱，并不意味着与其他变量组合时无用。</w:t>
+      </w:r>
+    </w:p>
+    <w:tbl>
+      <w:tblPr>
+        <w:tblStyle w:val="TableGrid"/>
+        <w:tblW w:type="auto" w:w="0"/>
+        <w:tblLook w:firstColumn="1" w:firstRow="1" w:lastColumn="0" w:lastRow="0" w:noHBand="0" w:noVBand="1" w:val="04A0"/>
+      </w:tblPr>
+      <w:tblGrid>
+        <w:gridCol w:w="3213"/>
+        <w:gridCol w:w="3213"/>
+        <w:gridCol w:w="3213"/>
+      </w:tblGrid>
+      <w:tr>
+        <w:trPr>
+          <w:tblHeader/>
+          <w:cantSplit/>
+        </w:trPr>
+        <w:tc>
+          <w:tcPr>
+            <w:tcW w:type="dxa" w:w="3213"/>
+          </w:tcPr>
+          <w:p>
+            <w:pPr>
+              <w:spacing w:after="60"/>
+            </w:pPr>
+            <w:r>
+              <w:rPr>
+                <w:b/>
+                <w:sz w:val="16"/>
+              </w:rPr>
+              <w:t>训练外折</w:t>
+            </w:r>
+          </w:p>
+        </w:tc>
+        <w:tc>
+          <w:tcPr>
+            <w:tcW w:type="dxa" w:w="3213"/>
+          </w:tcPr>
+          <w:p>
+            <w:pPr>
+              <w:spacing w:after="60"/>
+            </w:pPr>
+            <w:r>
+              <w:rPr>
+                <w:b/>
+                <w:sz w:val="16"/>
+              </w:rPr>
+              <w:t>仅当折训练内选出的前6列</w:t>
+            </w:r>
+          </w:p>
+        </w:tc>
+        <w:tc>
+          <w:tcPr>
+            <w:tcW w:type="dxa" w:w="3213"/>
+          </w:tcPr>
+          <w:p>
+            <w:pPr>
+              <w:spacing w:after="60"/>
+            </w:pPr>
+            <w:r>
+              <w:rPr>
+                <w:b/>
+                <w:sz w:val="16"/>
+              </w:rPr>
+              <w:t>非重复组数</w:t>
+            </w:r>
+          </w:p>
+        </w:tc>
+      </w:tr>
+      <w:tr>
+        <w:trPr>
+          <w:cantSplit/>
+        </w:trPr>
+        <w:tc>
+          <w:tcPr>
+            <w:tcW w:type="dxa" w:w="3213"/>
+          </w:tcPr>
+          <w:p>
+            <w:pPr>
+              <w:spacing w:after="60"/>
+            </w:pPr>
+            <w:r>
+              <w:rPr>
+                <w:b w:val="0"/>
+                <w:sz w:val="16"/>
+              </w:rPr>
+              <w:t>1</w:t>
+            </w:r>
+          </w:p>
+        </w:tc>
+        <w:tc>
+          <w:tcPr>
+            <w:tcW w:type="dxa" w:w="3213"/>
+          </w:tcPr>
+          <w:p>
+            <w:pPr>
+              <w:spacing w:after="60"/>
+            </w:pPr>
+            <w:r>
+              <w:rPr>
+                <w:b w:val="0"/>
+                <w:sz w:val="16"/>
+              </w:rPr>
+              <w:t>AI、PET、Alpha(AET/PET)、BIO7、AET、CECT</w:t>
+            </w:r>
+          </w:p>
+        </w:tc>
+        <w:tc>
+          <w:tcPr>
+            <w:tcW w:type="dxa" w:w="3213"/>
+          </w:tcPr>
+          <w:p>
+            <w:pPr>
+              <w:spacing w:after="60"/>
+            </w:pPr>
+            <w:r>
+              <w:rPr>
+                <w:b w:val="0"/>
+                <w:sz w:val="16"/>
+              </w:rPr>
+              <w:t>6</w:t>
+            </w:r>
+          </w:p>
+        </w:tc>
+      </w:tr>
+      <w:tr>
+        <w:trPr>
+          <w:cantSplit/>
+        </w:trPr>
+        <w:tc>
+          <w:tcPr>
+            <w:tcW w:type="dxa" w:w="3213"/>
+          </w:tcPr>
+          <w:p>
+            <w:pPr>
+              <w:spacing w:after="60"/>
+            </w:pPr>
+            <w:r>
+              <w:rPr>
+                <w:b w:val="0"/>
+                <w:sz w:val="16"/>
+              </w:rPr>
+              <w:t>2</w:t>
+            </w:r>
+          </w:p>
+        </w:tc>
+        <w:tc>
+          <w:tcPr>
+            <w:tcW w:type="dxa" w:w="3213"/>
+          </w:tcPr>
+          <w:p>
+            <w:pPr>
+              <w:spacing w:after="60"/>
+            </w:pPr>
+            <w:r>
+              <w:rPr>
+                <w:b w:val="0"/>
+                <w:sz w:val="16"/>
+              </w:rPr>
+              <w:t>PET、AET、AI、BIO7、TSiF、SOC</w:t>
+            </w:r>
+          </w:p>
+        </w:tc>
+        <w:tc>
+          <w:tcPr>
+            <w:tcW w:type="dxa" w:w="3213"/>
+          </w:tcPr>
+          <w:p>
+            <w:pPr>
+              <w:spacing w:after="60"/>
+            </w:pPr>
+            <w:r>
+              <w:rPr>
+                <w:b w:val="0"/>
+                <w:sz w:val="16"/>
+              </w:rPr>
+              <w:t>5</w:t>
+            </w:r>
+          </w:p>
+        </w:tc>
+      </w:tr>
+      <w:tr>
+        <w:trPr>
+          <w:cantSplit/>
+        </w:trPr>
+        <w:tc>
+          <w:tcPr>
+            <w:tcW w:type="dxa" w:w="3213"/>
+          </w:tcPr>
+          <w:p>
+            <w:pPr>
+              <w:spacing w:after="60"/>
+            </w:pPr>
+            <w:r>
+              <w:rPr>
+                <w:b w:val="0"/>
+                <w:sz w:val="16"/>
+              </w:rPr>
+              <w:t>3</w:t>
+            </w:r>
+          </w:p>
+        </w:tc>
+        <w:tc>
+          <w:tcPr>
+            <w:tcW w:type="dxa" w:w="3213"/>
+          </w:tcPr>
+          <w:p>
+            <w:pPr>
+              <w:spacing w:after="60"/>
+            </w:pPr>
+            <w:r>
+              <w:rPr>
+                <w:b w:val="0"/>
+                <w:sz w:val="16"/>
+              </w:rPr>
+              <w:t>PET、AI、AET、BIO7、Alpha(AET/PET)、SOC</w:t>
+            </w:r>
+          </w:p>
+        </w:tc>
+        <w:tc>
+          <w:tcPr>
+            <w:tcW w:type="dxa" w:w="3213"/>
+          </w:tcPr>
+          <w:p>
+            <w:pPr>
+              <w:spacing w:after="60"/>
+            </w:pPr>
+            <w:r>
+              <w:rPr>
+                <w:b w:val="0"/>
+                <w:sz w:val="16"/>
+              </w:rPr>
+              <w:t>6</w:t>
+            </w:r>
+          </w:p>
+        </w:tc>
+      </w:tr>
+      <w:tr>
+        <w:trPr>
+          <w:cantSplit/>
+        </w:trPr>
+        <w:tc>
+          <w:tcPr>
+            <w:tcW w:type="dxa" w:w="3213"/>
+          </w:tcPr>
+          <w:p>
+            <w:pPr>
+              <w:spacing w:after="60"/>
+            </w:pPr>
+            <w:r>
+              <w:rPr>
+                <w:b w:val="0"/>
+                <w:sz w:val="16"/>
+              </w:rPr>
+              <w:t>4</w:t>
+            </w:r>
+          </w:p>
+        </w:tc>
+        <w:tc>
+          <w:tcPr>
+            <w:tcW w:type="dxa" w:w="3213"/>
+          </w:tcPr>
+          <w:p>
+            <w:pPr>
+              <w:spacing w:after="60"/>
+            </w:pPr>
+            <w:r>
+              <w:rPr>
+                <w:b w:val="0"/>
+                <w:sz w:val="16"/>
+              </w:rPr>
+              <w:t>PET、AI、AET、Alpha(AET/PET)、BIO7、SpH</w:t>
+            </w:r>
+          </w:p>
+        </w:tc>
+        <w:tc>
+          <w:tcPr>
+            <w:tcW w:type="dxa" w:w="3213"/>
+          </w:tcPr>
+          <w:p>
+            <w:pPr>
+              <w:spacing w:after="60"/>
+            </w:pPr>
+            <w:r>
+              <w:rPr>
+                <w:b w:val="0"/>
+                <w:sz w:val="16"/>
+              </w:rPr>
+              <w:t>6</w:t>
+            </w:r>
+          </w:p>
+        </w:tc>
+      </w:tr>
+      <w:tr>
+        <w:trPr>
+          <w:cantSplit/>
+        </w:trPr>
+        <w:tc>
+          <w:tcPr>
+            <w:tcW w:type="dxa" w:w="3213"/>
+          </w:tcPr>
+          <w:p>
+            <w:pPr>
+              <w:spacing w:after="60"/>
+            </w:pPr>
+            <w:r>
+              <w:rPr>
+                <w:b w:val="0"/>
+                <w:sz w:val="16"/>
+              </w:rPr>
+              <w:t>5</w:t>
+            </w:r>
+          </w:p>
+        </w:tc>
+        <w:tc>
+          <w:tcPr>
+            <w:tcW w:type="dxa" w:w="3213"/>
+          </w:tcPr>
+          <w:p>
+            <w:pPr>
+              <w:spacing w:after="60"/>
+            </w:pPr>
+            <w:r>
+              <w:rPr>
+                <w:b w:val="0"/>
+                <w:sz w:val="16"/>
+              </w:rPr>
+              <w:t>AET、PET、AI、BIO7、Alpha(AET/PET)、SGC</w:t>
+            </w:r>
+          </w:p>
+        </w:tc>
+        <w:tc>
+          <w:tcPr>
+            <w:tcW w:type="dxa" w:w="3213"/>
+          </w:tcPr>
+          <w:p>
+            <w:pPr>
+              <w:spacing w:after="60"/>
+            </w:pPr>
+            <w:r>
+              <w:rPr>
+                <w:b w:val="0"/>
+                <w:sz w:val="16"/>
+              </w:rPr>
+              <w:t>6</w:t>
+            </w:r>
+          </w:p>
+        </w:tc>
+      </w:tr>
+    </w:tbl>
+    <w:p>
+      <w:r>
+        <w:rPr>
+          <w:b w:val="0"/>
+        </w:rPr>
+        <w:t>同一共享组在不同折中可能由SOC、TSiF、CECT或SpH等字段占位。它们在现有表中的数值关系相同，不能据这种排序差异解释土壤物理机制。应先核对原始字段提取与单位，再决定这些字段的科学保留方式。</w:t>
+      </w:r>
+    </w:p>
+    <w:p>
+      <w:r>
+        <w:rPr>
+          <w:b w:val="0"/>
+        </w:rPr>
+        <w:t>本轮训练CV选中的子集在测试上提高了0.0135，可作为简化模型的候选；仍需独立验证其稳定性。不能只因为少列或一次分数较高就认定它代表全部控制机制。</w:t>
+      </w:r>
+    </w:p>
+    <w:p>
+      <w:r>
+        <w:rPr>
+          <w:b w:val="0"/>
+        </w:rPr>
+        <w:t>研究目标是“不同因子对Li浓度的关系”，预测筛选与科学解释需要分开。某项删掉后分数不降，可能只是被相关变量替代，不代表它没有物理作用；置换重要性也不等于因果效应或可相加的贡献率。理论上关键的控制变量应结合研究依据判断，不能只按R²自动删除。</w:t>
+      </w:r>
+    </w:p>
+    <w:p>
+      <w:r>
+        <w:rPr>
+          <w:b w:val="0"/>
+        </w:rPr>
+        <w:t>验证限制：本轮训练CV被用于比较63个组合，其最优值可能乐观；没有把选中后的CV当作无偏泛化估计。固定测试也已在此前开发中被查看，属于内部验证。保留按训练CV确定的模型和所有正负结果，不根据测试最高值重新挑组。新的变量数结论仅针对RF、本数据和固定参数，不能直接推广至SVR、LightGBM或MLP。</w:t>
+      </w:r>
+    </w:p>
+    <w:p>
+      <w:r>
+        <w:rPr>
+          <w:b w:val="0"/>
+        </w:rPr>
+        <w:t>复现与记录：feature_selection/保存67组训练均值、335个逐折分数、每折内层排名训练/验证行号、最终选择记录、10个固定测试对照及逐行预测。运行python run_feature_selection.py重现；使用同目录frozen_data.npz和source_protocol.json，依赖与主目录一致。</w:t>
       </w:r>
     </w:p>
     <w:sectPr>

</xml_diff>

<commit_message>
Add runnable XGBoost Gaussian-process spline and ensemble Li methods
</commit_message>
<xml_diff>
--- a/li-concentration-regression/Li_group_meeting_report.docx
+++ b/li-concentration-regression/Li_group_meeting_report.docx
@@ -13117,6 +13117,652 @@
           <w:b w:val="0"/>
         </w:rPr>
         <w:t>复现与记录：feature_selection/保存67组训练均值、335个逐折分数、每折内层排名训练/验证行号、最终选择记录、10个固定测试对照及逐行预测。运行python run_feature_selection.py重现；使用同目录frozen_data.npz和source_protocol.json，依赖与主目录一致。</w:t>
+      </w:r>
+    </w:p>
+    <w:p>
+      <w:r>
+        <w:br w:type="page"/>
+      </w:r>
+    </w:p>
+    <w:p>
+      <w:pPr>
+        <w:pStyle w:val="Heading1"/>
+      </w:pPr>
+      <w:r>
+        <w:t>新方法补充：XGBoost、高斯过程与样条回归</w:t>
+      </w:r>
+    </w:p>
+    <w:p>
+      <w:r>
+        <w:rPr>
+          <w:b/>
+        </w:rPr>
+        <w:t>新增三种不同拟合思路，并检查RF与高斯过程组合。结果不是“换算法就能提高”：本轮三种单模型与组合均未超过四因子RF的固定测试R²=0.5538。</w:t>
+      </w:r>
+    </w:p>
+    <w:tbl>
+      <w:tblPr>
+        <w:tblStyle w:val="TableGrid"/>
+        <w:tblW w:type="auto" w:w="0"/>
+        <w:tblLook w:firstColumn="1" w:firstRow="1" w:lastColumn="0" w:lastRow="0" w:noHBand="0" w:noVBand="1" w:val="04A0"/>
+      </w:tblPr>
+      <w:tblGrid>
+        <w:gridCol w:w="2409"/>
+        <w:gridCol w:w="2409"/>
+        <w:gridCol w:w="2409"/>
+        <w:gridCol w:w="2409"/>
+      </w:tblGrid>
+      <w:tr>
+        <w:trPr>
+          <w:tblHeader/>
+          <w:cantSplit/>
+        </w:trPr>
+        <w:tc>
+          <w:tcPr>
+            <w:tcW w:type="dxa" w:w="2409"/>
+          </w:tcPr>
+          <w:p>
+            <w:r>
+              <w:rPr>
+                <w:sz w:val="18"/>
+              </w:rPr>
+              <w:t>方案</w:t>
+            </w:r>
+          </w:p>
+        </w:tc>
+        <w:tc>
+          <w:tcPr>
+            <w:tcW w:type="dxa" w:w="2409"/>
+          </w:tcPr>
+          <w:p>
+            <w:r>
+              <w:rPr>
+                <w:sz w:val="18"/>
+              </w:rPr>
+              <w:t>训练CV R² ±折间SD</w:t>
+            </w:r>
+          </w:p>
+        </w:tc>
+        <w:tc>
+          <w:tcPr>
+            <w:tcW w:type="dxa" w:w="2409"/>
+          </w:tcPr>
+          <w:p>
+            <w:r>
+              <w:rPr>
+                <w:sz w:val="18"/>
+              </w:rPr>
+              <w:t>固定测试R²</w:t>
+            </w:r>
+          </w:p>
+        </w:tc>
+        <w:tc>
+          <w:tcPr>
+            <w:tcW w:type="dxa" w:w="2409"/>
+          </w:tcPr>
+          <w:p>
+            <w:r>
+              <w:rPr>
+                <w:sz w:val="18"/>
+              </w:rPr>
+              <w:t>含义</w:t>
+            </w:r>
+          </w:p>
+        </w:tc>
+      </w:tr>
+      <w:tr>
+        <w:trPr>
+          <w:cantSplit/>
+        </w:trPr>
+        <w:tc>
+          <w:tcPr>
+            <w:tcW w:type="dxa" w:w="2409"/>
+          </w:tcPr>
+          <w:p>
+            <w:r>
+              <w:rPr>
+                <w:sz w:val="18"/>
+              </w:rPr>
+              <w:t>四因子RF对照</w:t>
+            </w:r>
+          </w:p>
+        </w:tc>
+        <w:tc>
+          <w:tcPr>
+            <w:tcW w:type="dxa" w:w="2409"/>
+          </w:tcPr>
+          <w:p>
+            <w:r>
+              <w:rPr>
+                <w:sz w:val="18"/>
+              </w:rPr>
+              <w:t>0.4503 ± 0.0540</w:t>
+            </w:r>
+          </w:p>
+        </w:tc>
+        <w:tc>
+          <w:tcPr>
+            <w:tcW w:type="dxa" w:w="2409"/>
+          </w:tcPr>
+          <w:p>
+            <w:r>
+              <w:rPr>
+                <w:sz w:val="18"/>
+              </w:rPr>
+              <w:t>0.5538</w:t>
+            </w:r>
+          </w:p>
+        </w:tc>
+        <w:tc>
+          <w:tcPr>
+            <w:tcW w:type="dxa" w:w="2409"/>
+          </w:tcPr>
+          <w:p>
+            <w:r>
+              <w:rPr>
+                <w:sz w:val="18"/>
+              </w:rPr>
+              <w:t>保留现有比较基准</w:t>
+            </w:r>
+          </w:p>
+        </w:tc>
+      </w:tr>
+      <w:tr>
+        <w:trPr>
+          <w:cantSplit/>
+        </w:trPr>
+        <w:tc>
+          <w:tcPr>
+            <w:tcW w:type="dxa" w:w="2409"/>
+          </w:tcPr>
+          <w:p>
+            <w:r>
+              <w:rPr>
+                <w:sz w:val="18"/>
+              </w:rPr>
+              <w:t>XGBoost</w:t>
+            </w:r>
+          </w:p>
+        </w:tc>
+        <w:tc>
+          <w:tcPr>
+            <w:tcW w:type="dxa" w:w="2409"/>
+          </w:tcPr>
+          <w:p>
+            <w:r>
+              <w:rPr>
+                <w:sz w:val="18"/>
+              </w:rPr>
+              <w:t>0.4217 ± 0.0561</w:t>
+            </w:r>
+          </w:p>
+        </w:tc>
+        <w:tc>
+          <w:tcPr>
+            <w:tcW w:type="dxa" w:w="2409"/>
+          </w:tcPr>
+          <w:p>
+            <w:r>
+              <w:rPr>
+                <w:sz w:val="18"/>
+              </w:rPr>
+              <w:t>0.4982</w:t>
+            </w:r>
+          </w:p>
+        </w:tc>
+        <w:tc>
+          <w:tcPr>
+            <w:tcW w:type="dxa" w:w="2409"/>
+          </w:tcPr>
+          <w:p>
+            <w:r>
+              <w:rPr>
+                <w:sz w:val="18"/>
+              </w:rPr>
+              <w:t>多棵小树逐步纠错，带正则化</w:t>
+            </w:r>
+          </w:p>
+        </w:tc>
+      </w:tr>
+      <w:tr>
+        <w:trPr>
+          <w:cantSplit/>
+        </w:trPr>
+        <w:tc>
+          <w:tcPr>
+            <w:tcW w:type="dxa" w:w="2409"/>
+          </w:tcPr>
+          <w:p>
+            <w:r>
+              <w:rPr>
+                <w:sz w:val="18"/>
+              </w:rPr>
+              <w:t>高斯过程回归</w:t>
+            </w:r>
+          </w:p>
+        </w:tc>
+        <w:tc>
+          <w:tcPr>
+            <w:tcW w:type="dxa" w:w="2409"/>
+          </w:tcPr>
+          <w:p>
+            <w:r>
+              <w:rPr>
+                <w:sz w:val="18"/>
+              </w:rPr>
+              <w:t>0.4598 ± 0.0363</w:t>
+            </w:r>
+          </w:p>
+        </w:tc>
+        <w:tc>
+          <w:tcPr>
+            <w:tcW w:type="dxa" w:w="2409"/>
+          </w:tcPr>
+          <w:p>
+            <w:r>
+              <w:rPr>
+                <w:sz w:val="18"/>
+              </w:rPr>
+              <w:t>0.5440</w:t>
+            </w:r>
+          </w:p>
+        </w:tc>
+        <w:tc>
+          <w:tcPr>
+            <w:tcW w:type="dxa" w:w="2409"/>
+          </w:tcPr>
+          <w:p>
+            <w:r>
+              <w:rPr>
+                <w:sz w:val="18"/>
+              </w:rPr>
+              <w:t>用核函数拟合相似样本的关系</w:t>
+            </w:r>
+          </w:p>
+        </w:tc>
+      </w:tr>
+      <w:tr>
+        <w:trPr>
+          <w:cantSplit/>
+        </w:trPr>
+        <w:tc>
+          <w:tcPr>
+            <w:tcW w:type="dxa" w:w="2409"/>
+          </w:tcPr>
+          <w:p>
+            <w:r>
+              <w:rPr>
+                <w:sz w:val="18"/>
+              </w:rPr>
+              <w:t>样条加性回归</w:t>
+            </w:r>
+          </w:p>
+        </w:tc>
+        <w:tc>
+          <w:tcPr>
+            <w:tcW w:type="dxa" w:w="2409"/>
+          </w:tcPr>
+          <w:p>
+            <w:r>
+              <w:rPr>
+                <w:sz w:val="18"/>
+              </w:rPr>
+              <w:t>0.4054 ± 0.0697</w:t>
+            </w:r>
+          </w:p>
+        </w:tc>
+        <w:tc>
+          <w:tcPr>
+            <w:tcW w:type="dxa" w:w="2409"/>
+          </w:tcPr>
+          <w:p>
+            <w:r>
+              <w:rPr>
+                <w:sz w:val="18"/>
+              </w:rPr>
+              <w:t>0.4939</w:t>
+            </w:r>
+          </w:p>
+        </w:tc>
+        <w:tc>
+          <w:tcPr>
+            <w:tcW w:type="dxa" w:w="2409"/>
+          </w:tcPr>
+          <w:p>
+            <w:r>
+              <w:rPr>
+                <w:sz w:val="18"/>
+              </w:rPr>
+              <w:t>平滑拟合各因子后相加</w:t>
+            </w:r>
+          </w:p>
+        </w:tc>
+      </w:tr>
+      <w:tr>
+        <w:trPr>
+          <w:cantSplit/>
+        </w:trPr>
+        <w:tc>
+          <w:tcPr>
+            <w:tcW w:type="dxa" w:w="2409"/>
+          </w:tcPr>
+          <w:p>
+            <w:r>
+              <w:rPr>
+                <w:sz w:val="18"/>
+              </w:rPr>
+              <w:t>RF30%＋GP70%</w:t>
+            </w:r>
+          </w:p>
+        </w:tc>
+        <w:tc>
+          <w:tcPr>
+            <w:tcW w:type="dxa" w:w="2409"/>
+          </w:tcPr>
+          <w:p>
+            <w:r>
+              <w:rPr>
+                <w:sz w:val="18"/>
+              </w:rPr>
+              <w:t>0.4626 ± 0.0396</w:t>
+            </w:r>
+          </w:p>
+        </w:tc>
+        <w:tc>
+          <w:tcPr>
+            <w:tcW w:type="dxa" w:w="2409"/>
+          </w:tcPr>
+          <w:p>
+            <w:r>
+              <w:rPr>
+                <w:sz w:val="18"/>
+              </w:rPr>
+              <w:t>0.5506</w:t>
+            </w:r>
+          </w:p>
+        </w:tc>
+        <w:tc>
+          <w:tcPr>
+            <w:tcW w:type="dxa" w:w="2409"/>
+          </w:tcPr>
+          <w:p>
+            <w:r>
+              <w:rPr>
+                <w:sz w:val="18"/>
+              </w:rPr>
+              <w:t>训练CV选出的加权比例</w:t>
+            </w:r>
+          </w:p>
+        </w:tc>
+      </w:tr>
+    </w:tbl>
+    <w:p>
+      <w:r>
+        <w:rPr>
+          <w:b w:val="0"/>
+        </w:rPr>
+        <w:t>原始23列在当前表中有18列共享信息，故新方法各比较既定4因子与6组输入；分别只按训练CV挑选参数及输入组数，三种方法均选中4因子。XGBoost 48组、高斯过程32组、样条回归48组，共128组、640个五折验证分数；再用训练OOF预测比较11个RF/GP权重。所有参数和权重均在本轮固定测试预测前写入选择记录。</w:t>
+      </w:r>
+    </w:p>
+    <w:p>
+      <w:r>
+        <w:rPr>
+          <w:b w:val="0"/>
+        </w:rPr>
+        <w:t>XGBoost采用官方CPU实现：逐轮拟合残差，并控制树深、叶子约束、学习率与正则化。高斯过程采用StandardScaler＋Matérn1.5核＋白噪声项，输入尺度及目标均值方差只由训练数据估计；本轮在固定核参数网格上用CV选择，未采用核参数数值优化。样条回归用分位数节点的B样条基函数＋标准化＋岭回归，属于加性平滑模型，不包含显式交互项，也不是完整GAM软件。</w:t>
+      </w:r>
+    </w:p>
+    <w:tbl>
+      <w:tblPr>
+        <w:tblStyle w:val="TableGrid"/>
+        <w:tblW w:type="auto" w:w="0"/>
+        <w:tblLook w:firstColumn="1" w:firstRow="1" w:lastColumn="0" w:lastRow="0" w:noHBand="0" w:noVBand="1" w:val="04A0"/>
+      </w:tblPr>
+      <w:tblGrid>
+        <w:gridCol w:w="4819"/>
+        <w:gridCol w:w="4819"/>
+      </w:tblGrid>
+      <w:tr>
+        <w:trPr>
+          <w:tblHeader/>
+          <w:cantSplit/>
+        </w:trPr>
+        <w:tc>
+          <w:tcPr>
+            <w:tcW w:type="dxa" w:w="4819"/>
+          </w:tcPr>
+          <w:p>
+            <w:r>
+              <w:rPr>
+                <w:sz w:val="18"/>
+              </w:rPr>
+              <w:t>方法</w:t>
+            </w:r>
+          </w:p>
+        </w:tc>
+        <w:tc>
+          <w:tcPr>
+            <w:tcW w:type="dxa" w:w="4819"/>
+          </w:tcPr>
+          <w:p>
+            <w:r>
+              <w:rPr>
+                <w:sz w:val="18"/>
+              </w:rPr>
+              <w:t>训练CV选中配置</w:t>
+            </w:r>
+          </w:p>
+        </w:tc>
+      </w:tr>
+      <w:tr>
+        <w:trPr>
+          <w:cantSplit/>
+        </w:trPr>
+        <w:tc>
+          <w:tcPr>
+            <w:tcW w:type="dxa" w:w="4819"/>
+          </w:tcPr>
+          <w:p>
+            <w:r>
+              <w:rPr>
+                <w:sz w:val="18"/>
+              </w:rPr>
+              <w:t>XGBoost</w:t>
+            </w:r>
+          </w:p>
+        </w:tc>
+        <w:tc>
+          <w:tcPr>
+            <w:tcW w:type="dxa" w:w="4819"/>
+          </w:tcPr>
+          <w:p>
+            <w:r>
+              <w:rPr>
+                <w:sz w:val="18"/>
+              </w:rPr>
+              <w:t>{"subsample": 1.0, "reg_lambda": 1.0, "reg_alpha": 0.0, "n_estimators": 1000, "min_child_weight": 10, "max_depth": 3, "learning_rate": 0.01, "colsample_bytree": 0.7}</w:t>
+            </w:r>
+          </w:p>
+        </w:tc>
+      </w:tr>
+      <w:tr>
+        <w:trPr>
+          <w:cantSplit/>
+        </w:trPr>
+        <w:tc>
+          <w:tcPr>
+            <w:tcW w:type="dxa" w:w="4819"/>
+          </w:tcPr>
+          <w:p>
+            <w:r>
+              <w:rPr>
+                <w:sz w:val="18"/>
+              </w:rPr>
+              <w:t>GaussianProcess</w:t>
+            </w:r>
+          </w:p>
+        </w:tc>
+        <w:tc>
+          <w:tcPr>
+            <w:tcW w:type="dxa" w:w="4819"/>
+          </w:tcPr>
+          <w:p>
+            <w:r>
+              <w:rPr>
+                <w:sz w:val="18"/>
+              </w:rPr>
+              <w:t>{"kernel": "Matern15", "length_scale": 0.3, "noise": 0.5}</w:t>
+            </w:r>
+          </w:p>
+        </w:tc>
+      </w:tr>
+      <w:tr>
+        <w:trPr>
+          <w:cantSplit/>
+        </w:trPr>
+        <w:tc>
+          <w:tcPr>
+            <w:tcW w:type="dxa" w:w="4819"/>
+          </w:tcPr>
+          <w:p>
+            <w:r>
+              <w:rPr>
+                <w:sz w:val="18"/>
+              </w:rPr>
+              <w:t>SplineRidge</w:t>
+            </w:r>
+          </w:p>
+        </w:tc>
+        <w:tc>
+          <w:tcPr>
+            <w:tcW w:type="dxa" w:w="4819"/>
+          </w:tcPr>
+          <w:p>
+            <w:r>
+              <w:rPr>
+                <w:sz w:val="18"/>
+              </w:rPr>
+              <w:t>{"n_knots": 20, "degree": 2, "alpha": 10.0}</w:t>
+            </w:r>
+          </w:p>
+        </w:tc>
+      </w:tr>
+    </w:tbl>
+    <w:p>
+      <w:r>
+        <w:rPr>
+          <w:b w:val="0"/>
+        </w:rPr>
+        <w:t>四个候选代码均已在原QSH.xlsx实际执行；训练1090条、测试273条和四因子输入保持一致，逐行预测与冻结实验一致。未新增删样本，目标仍为ln(1+Li)，负预测使用同一固定非负下限。</w:t>
+      </w:r>
+    </w:p>
+    <w:p>
+      <w:r>
+        <w:br w:type="page"/>
+      </w:r>
+    </w:p>
+    <w:p>
+      <w:pPr>
+        <w:pStyle w:val="Heading1"/>
+      </w:pPr>
+      <w:r>
+        <w:t>新方法：代码运行、解释与验证限制</w:t>
+      </w:r>
+    </w:p>
+    <w:p>
+      <w:r>
+        <w:rPr>
+          <w:b/>
+        </w:rPr>
+        <w:t>直接运行（在完整代码包根目录执行）</w:t>
+      </w:r>
+    </w:p>
+    <w:p>
+      <w:r>
+        <w:rPr>
+          <w:b w:val="0"/>
+        </w:rPr>
+        <w:t>python -m pip install -r requirements_other_methods.txt</w:t>
+      </w:r>
+    </w:p>
+    <w:p>
+      <w:r>
+        <w:rPr>
+          <w:b w:val="0"/>
+        </w:rPr>
+        <w:t>python code/Li_other_methods.py QSH.xlsx --method xgboost</w:t>
+      </w:r>
+    </w:p>
+    <w:p>
+      <w:r>
+        <w:rPr>
+          <w:b w:val="0"/>
+        </w:rPr>
+        <w:t>python code/Li_other_methods.py QSH.xlsx --method gpr</w:t>
+      </w:r>
+    </w:p>
+    <w:p>
+      <w:r>
+        <w:rPr>
+          <w:b w:val="0"/>
+        </w:rPr>
+        <w:t>python code/Li_other_methods.py QSH.xlsx --method spline</w:t>
+      </w:r>
+    </w:p>
+    <w:p>
+      <w:r>
+        <w:rPr>
+          <w:b w:val="0"/>
+        </w:rPr>
+        <w:t>python code/Li_other_methods.py QSH.xlsx --method rf_gp</w:t>
+      </w:r>
+    </w:p>
+    <w:p>
+      <w:r>
+        <w:rPr>
+          <w:b w:val="0"/>
+        </w:rPr>
+        <w:t>新代码复用code/RF_modified.py中的原清洗函数，原RF文件须放在同一个code目录；专用压缩包已包含该依赖。默认rf_gp对应训练CV最高的新候选，但不自动替换原RF。各模式保存metrics.xlsx、predictions.xlsx、feature_importance.xlsx、fit.png和importance.png。重要性对组合模型本身重新置换评价，没有将各基模型的重要性直接相加。</w:t>
+      </w:r>
+    </w:p>
+    <w:p>
+      <w:r>
+        <w:rPr>
+          <w:b/>
+        </w:rPr>
+        <w:t>推荐如何解读</w:t>
+      </w:r>
+    </w:p>
+    <w:p>
+      <w:r>
+        <w:rPr>
+          <w:b w:val="0"/>
+        </w:rPr>
+        <w:t>现有四因子RF固定测试R²约0.5538；高斯过程约0.5440，组合约0.5506，差异较小。与此同时，组合与高斯过程训练CV分别约0.4626、0.4598，高于RF的0.4503，因此不能根据一次固定测试结果宣称RF在所有新样本上更优。建议保留RF对照与全部新方法结果，并用真正独立的新样本检验；本轮没有获得明确突破，也没有证明R²达到上限。</w:t>
+      </w:r>
+    </w:p>
+    <w:p>
+      <w:r>
+        <w:rPr>
+          <w:b w:val="0"/>
+        </w:rPr>
+        <w:t>四因子选择此前已经使用过同一训练数据，因此新方法CV是在既定输入方案下的开发比较，不能作为从原始23列开始、完整嵌套筛选流程的无偏估计。参数搜索本身也会带来选择乐观。固定测试已在此前多轮开发中查看；虽然本轮未用测试分数挑参数，仍不能将其当作未触碰的外部验证。</w:t>
+      </w:r>
+    </w:p>
+    <w:p>
+      <w:r>
+        <w:rPr>
+          <w:b w:val="0"/>
+        </w:rPr>
+        <w:t>高斯过程直接拟合相似样本，训练计算量随样本数增加较快；本数据量可以运行，但不能据此保证大规模数据成本相同。样条加性模型便于观察平滑关系，但缺少显式交互可能限制拟合。XGBoost虽然适用于表格数据，仍依赖当前输入中的信息与噪声，算法成熟并不保证R²必然提高。以上限制是选型解释，不是对本数据瓶颈的确定归因。</w:t>
+      </w:r>
+    </w:p>
+    <w:p>
+      <w:r>
+        <w:rPr>
+          <w:b w:val="0"/>
+        </w:rPr>
+        <w:t>成熟开源来源：github.com/dmlc/xgboost；github.com/scikit-learn/scikit-learn下的gaussian_process、SplineTransformer、Ridge、VotingRegressor。依赖版本及全部参数、逐折分数、组合权重、行号预测、实跑日志保存在other_methods/。</w:t>
       </w:r>
     </w:p>
     <w:sectPr>

</xml_diff>